<commit_message>
docs: format course design front matter
</commit_message>
<xml_diff>
--- a/docs/course-design/赵文彪-飞跃.docx
+++ b/docs/course-design/赵文彪-飞跃.docx
@@ -103,214 +103,360 @@
         </w:rPr>
       </w:r>
     </w:p>
-    <w:p>
-      <w:pPr>
+    <w:tbl>
+      <w:tblPr>
+        <w:tblW w:type="dxa" w:w="7371"/>
         <w:jc w:val="center"/>
-        <w:spacing w:line="360" w:lineRule="auto"/>
-      </w:pPr>
-      <w:r>
-        <w:rPr>
-          <w:rFonts w:ascii="Times New Roman" w:hAnsi="Times New Roman" w:eastAsia="宋体"/>
-          <w:b w:val="0"/>
-          <w:color w:val="000000"/>
-          <w:sz w:val="32"/>
-          <w:u w:val="none"/>
-        </w:rPr>
-        <w:t>题　　目：</w:t>
-      </w:r>
-      <w:r>
-        <w:rPr>
-          <w:rFonts w:ascii="Times New Roman" w:hAnsi="Times New Roman" w:eastAsia="宋体"/>
-          <w:b w:val="0"/>
-          <w:color w:val="000000"/>
-          <w:sz w:val="32"/>
-          <w:u w:val="single"/>
-        </w:rPr>
-        <w:t xml:space="preserve">　新疆大学飞跃手册（xju-feiyue）　</w:t>
-      </w:r>
-    </w:p>
-    <w:p>
-      <w:pPr>
-        <w:jc w:val="center"/>
-        <w:spacing w:line="360" w:lineRule="auto"/>
-      </w:pPr>
-      <w:r>
-        <w:rPr>
-          <w:rFonts w:ascii="Times New Roman" w:hAnsi="Times New Roman" w:eastAsia="宋体"/>
-          <w:b w:val="0"/>
-          <w:color w:val="000000"/>
-          <w:sz w:val="32"/>
-          <w:u w:val="none"/>
-        </w:rPr>
-        <w:t>团　　队：</w:t>
-      </w:r>
-      <w:r>
-        <w:rPr>
-          <w:rFonts w:ascii="Times New Roman" w:hAnsi="Times New Roman" w:eastAsia="宋体"/>
-          <w:b w:val="0"/>
-          <w:color w:val="000000"/>
-          <w:sz w:val="32"/>
-          <w:u w:val="single"/>
-        </w:rPr>
-        <w:t xml:space="preserve">　　　　　　　　　　</w:t>
-      </w:r>
-    </w:p>
-    <w:p>
-      <w:pPr>
-        <w:jc w:val="center"/>
-        <w:spacing w:line="360" w:lineRule="auto"/>
-      </w:pPr>
-      <w:r>
-        <w:rPr>
-          <w:rFonts w:ascii="Times New Roman" w:hAnsi="Times New Roman" w:eastAsia="宋体"/>
-          <w:b w:val="0"/>
-          <w:color w:val="000000"/>
-          <w:sz w:val="32"/>
-          <w:u w:val="none"/>
-        </w:rPr>
-        <w:t>姓　　名：</w:t>
-      </w:r>
-      <w:r>
-        <w:rPr>
-          <w:rFonts w:ascii="Times New Roman" w:hAnsi="Times New Roman" w:eastAsia="宋体"/>
-          <w:b w:val="0"/>
-          <w:color w:val="000000"/>
-          <w:sz w:val="32"/>
-          <w:u w:val="single"/>
-        </w:rPr>
-        <w:t xml:space="preserve">　　　赵文彪　　　　</w:t>
-      </w:r>
-    </w:p>
-    <w:p>
-      <w:pPr>
-        <w:jc w:val="center"/>
-        <w:spacing w:line="360" w:lineRule="auto"/>
-      </w:pPr>
-      <w:r>
-        <w:rPr>
-          <w:rFonts w:ascii="Times New Roman" w:hAnsi="Times New Roman" w:eastAsia="宋体"/>
-          <w:b w:val="0"/>
-          <w:color w:val="000000"/>
-          <w:sz w:val="32"/>
-          <w:u w:val="none"/>
-        </w:rPr>
-        <w:t xml:space="preserve">　　　　：</w:t>
-      </w:r>
-      <w:r>
-        <w:rPr>
-          <w:rFonts w:ascii="Times New Roman" w:hAnsi="Times New Roman" w:eastAsia="宋体"/>
-          <w:b w:val="0"/>
-          <w:color w:val="000000"/>
-          <w:sz w:val="32"/>
-          <w:u w:val="single"/>
-        </w:rPr>
-        <w:t xml:space="preserve">　　　　　　　　　　</w:t>
-      </w:r>
-    </w:p>
-    <w:p>
-      <w:pPr>
-        <w:jc w:val="center"/>
-        <w:spacing w:line="360" w:lineRule="auto"/>
-      </w:pPr>
-      <w:r>
-        <w:rPr>
-          <w:rFonts w:ascii="Times New Roman" w:hAnsi="Times New Roman" w:eastAsia="宋体"/>
-          <w:b w:val="0"/>
-          <w:color w:val="000000"/>
-          <w:sz w:val="32"/>
-          <w:u w:val="none"/>
-        </w:rPr>
-        <w:t>所在学院：</w:t>
-      </w:r>
-      <w:r>
-        <w:rPr>
-          <w:rFonts w:ascii="Times New Roman" w:hAnsi="Times New Roman" w:eastAsia="宋体"/>
-          <w:b w:val="0"/>
-          <w:color w:val="000000"/>
-          <w:sz w:val="32"/>
-          <w:u w:val="single"/>
-        </w:rPr>
-        <w:t xml:space="preserve">　计算机科学与技术学院　</w:t>
-      </w:r>
-    </w:p>
-    <w:p>
-      <w:pPr>
-        <w:jc w:val="center"/>
-        <w:spacing w:line="360" w:lineRule="auto"/>
-      </w:pPr>
-      <w:r>
-        <w:rPr>
-          <w:rFonts w:ascii="Times New Roman" w:hAnsi="Times New Roman" w:eastAsia="宋体"/>
-          <w:b w:val="0"/>
-          <w:color w:val="000000"/>
-          <w:sz w:val="32"/>
-          <w:u w:val="none"/>
-        </w:rPr>
-        <w:t>班　　级：</w:t>
-      </w:r>
-      <w:r>
-        <w:rPr>
-          <w:rFonts w:ascii="Times New Roman" w:hAnsi="Times New Roman" w:eastAsia="宋体"/>
-          <w:b w:val="0"/>
-          <w:color w:val="000000"/>
-          <w:sz w:val="32"/>
-          <w:u w:val="single"/>
-        </w:rPr>
-        <w:t xml:space="preserve">　　　　　　　　　　</w:t>
-      </w:r>
-    </w:p>
-    <w:p>
-      <w:pPr>
-        <w:jc w:val="center"/>
-        <w:spacing w:line="360" w:lineRule="auto"/>
-      </w:pPr>
-      <w:r>
-        <w:rPr>
-          <w:rFonts w:ascii="Times New Roman" w:hAnsi="Times New Roman" w:eastAsia="宋体"/>
-          <w:b w:val="0"/>
-          <w:color w:val="000000"/>
-          <w:sz w:val="32"/>
-          <w:u w:val="none"/>
-        </w:rPr>
-        <w:t>指导教师：</w:t>
-      </w:r>
-      <w:r>
-        <w:rPr>
-          <w:rFonts w:ascii="Times New Roman" w:hAnsi="Times New Roman" w:eastAsia="宋体"/>
-          <w:b w:val="0"/>
-          <w:color w:val="000000"/>
-          <w:sz w:val="32"/>
-          <w:u w:val="single"/>
-        </w:rPr>
-        <w:t xml:space="preserve">　　买合木提·买买提　　</w:t>
-      </w:r>
-    </w:p>
-    <w:p>
-      <w:pPr>
-        <w:jc w:val="center"/>
-        <w:spacing w:line="360" w:lineRule="auto"/>
-      </w:pPr>
-      <w:r>
-        <w:rPr>
-          <w:rFonts w:ascii="Times New Roman" w:hAnsi="Times New Roman" w:eastAsia="宋体"/>
-          <w:b w:val="0"/>
-          <w:color w:val="000000"/>
-          <w:sz w:val="32"/>
-          <w:u w:val="none"/>
-        </w:rPr>
-        <w:t>职　　称：</w:t>
-      </w:r>
-      <w:r>
-        <w:rPr>
-          <w:rFonts w:ascii="Times New Roman" w:hAnsi="Times New Roman" w:eastAsia="宋体"/>
-          <w:b w:val="0"/>
-          <w:color w:val="000000"/>
-          <w:sz w:val="32"/>
-          <w:u w:val="single"/>
-        </w:rPr>
-        <w:t xml:space="preserve">　　　高级实验师　　　　</w:t>
-      </w:r>
-    </w:p>
+        <w:tblLook w:firstColumn="1" w:firstRow="1" w:lastColumn="0" w:lastRow="0" w:noHBand="0" w:noVBand="1" w:val="04A0"/>
+        <w:tblLayout w:type="fixed"/>
+        <w:tblBorders>
+          <w:top w:val="nil"/>
+          <w:left w:val="nil"/>
+          <w:bottom w:val="nil"/>
+          <w:right w:val="nil"/>
+          <w:insideH w:val="nil"/>
+          <w:insideV w:val="nil"/>
+        </w:tblBorders>
+      </w:tblPr>
+      <w:tblGrid>
+        <w:gridCol w:w="4156"/>
+        <w:gridCol w:w="4156"/>
+      </w:tblGrid>
+      <w:tr>
+        <w:trPr>
+          <w:trHeight w:val="408" w:hRule="atLeast"/>
+        </w:trPr>
+        <w:tc>
+          <w:tcPr>
+            <w:tcW w:type="dxa" w:w="1757"/>
+            <w:vAlign w:val="center"/>
+          </w:tcPr>
+          <w:p>
+            <w:pPr>
+              <w:spacing w:before="0" w:after="0" w:line="240" w:lineRule="auto"/>
+              <w:jc w:val="right"/>
+            </w:pPr>
+            <w:r>
+              <w:rPr>
+                <w:rFonts w:ascii="Times New Roman" w:hAnsi="Times New Roman" w:eastAsia="宋体"/>
+                <w:b w:val="0"/>
+                <w:sz w:val="28"/>
+              </w:rPr>
+              <w:t>题　　目：</w:t>
+            </w:r>
+          </w:p>
+        </w:tc>
+        <w:tc>
+          <w:tcPr>
+            <w:tcW w:type="dxa" w:w="5613"/>
+            <w:vAlign w:val="center"/>
+            <w:tcBorders>
+              <w:bottom w:val="single" w:sz="8" w:space="0" w:color="000000"/>
+            </w:tcBorders>
+          </w:tcPr>
+          <w:p>
+            <w:pPr>
+              <w:spacing w:before="0" w:after="0" w:line="240" w:lineRule="auto"/>
+              <w:jc w:val="center"/>
+            </w:pPr>
+            <w:r>
+              <w:rPr>
+                <w:rFonts w:ascii="Times New Roman" w:hAnsi="Times New Roman" w:eastAsia="宋体"/>
+                <w:b w:val="0"/>
+                <w:sz w:val="28"/>
+              </w:rPr>
+              <w:t>新疆大学飞跃手册（xju-feiyue）</w:t>
+            </w:r>
+          </w:p>
+        </w:tc>
+      </w:tr>
+      <w:tr>
+        <w:trPr>
+          <w:trHeight w:val="408" w:hRule="atLeast"/>
+        </w:trPr>
+        <w:tc>
+          <w:tcPr>
+            <w:tcW w:type="dxa" w:w="1757"/>
+            <w:vAlign w:val="center"/>
+          </w:tcPr>
+          <w:p>
+            <w:pPr>
+              <w:spacing w:before="0" w:after="0" w:line="240" w:lineRule="auto"/>
+              <w:jc w:val="right"/>
+            </w:pPr>
+            <w:r>
+              <w:rPr>
+                <w:rFonts w:ascii="Times New Roman" w:hAnsi="Times New Roman" w:eastAsia="宋体"/>
+                <w:b w:val="0"/>
+                <w:sz w:val="28"/>
+              </w:rPr>
+              <w:t>团　　队：</w:t>
+            </w:r>
+          </w:p>
+        </w:tc>
+        <w:tc>
+          <w:tcPr>
+            <w:tcW w:type="dxa" w:w="5613"/>
+            <w:vAlign w:val="center"/>
+            <w:tcBorders>
+              <w:bottom w:val="single" w:sz="8" w:space="0" w:color="000000"/>
+            </w:tcBorders>
+          </w:tcPr>
+          <w:p>
+            <w:pPr>
+              <w:spacing w:before="0" w:after="0" w:line="240" w:lineRule="auto"/>
+              <w:jc w:val="center"/>
+            </w:pPr>
+            <w:r>
+              <w:rPr>
+                <w:rFonts w:ascii="Times New Roman" w:hAnsi="Times New Roman" w:eastAsia="宋体"/>
+                <w:b w:val="0"/>
+                <w:sz w:val="28"/>
+              </w:rPr>
+            </w:r>
+          </w:p>
+        </w:tc>
+      </w:tr>
+      <w:tr>
+        <w:trPr>
+          <w:trHeight w:val="408" w:hRule="atLeast"/>
+        </w:trPr>
+        <w:tc>
+          <w:tcPr>
+            <w:tcW w:type="dxa" w:w="1757"/>
+            <w:vAlign w:val="center"/>
+          </w:tcPr>
+          <w:p>
+            <w:pPr>
+              <w:spacing w:before="0" w:after="0" w:line="240" w:lineRule="auto"/>
+              <w:jc w:val="right"/>
+            </w:pPr>
+            <w:r>
+              <w:rPr>
+                <w:rFonts w:ascii="Times New Roman" w:hAnsi="Times New Roman" w:eastAsia="宋体"/>
+                <w:b w:val="0"/>
+                <w:sz w:val="28"/>
+              </w:rPr>
+              <w:t>姓　　名：</w:t>
+            </w:r>
+          </w:p>
+        </w:tc>
+        <w:tc>
+          <w:tcPr>
+            <w:tcW w:type="dxa" w:w="5613"/>
+            <w:vAlign w:val="center"/>
+            <w:tcBorders>
+              <w:bottom w:val="single" w:sz="8" w:space="0" w:color="000000"/>
+            </w:tcBorders>
+          </w:tcPr>
+          <w:p>
+            <w:pPr>
+              <w:spacing w:before="0" w:after="0" w:line="240" w:lineRule="auto"/>
+              <w:jc w:val="center"/>
+            </w:pPr>
+            <w:r>
+              <w:rPr>
+                <w:rFonts w:ascii="Times New Roman" w:hAnsi="Times New Roman" w:eastAsia="宋体"/>
+                <w:b w:val="0"/>
+                <w:sz w:val="28"/>
+              </w:rPr>
+              <w:t>赵文彪</w:t>
+            </w:r>
+          </w:p>
+        </w:tc>
+      </w:tr>
+      <w:tr>
+        <w:trPr>
+          <w:trHeight w:val="408" w:hRule="atLeast"/>
+        </w:trPr>
+        <w:tc>
+          <w:tcPr>
+            <w:tcW w:type="dxa" w:w="1757"/>
+            <w:vAlign w:val="center"/>
+          </w:tcPr>
+          <w:p>
+            <w:pPr>
+              <w:spacing w:before="0" w:after="0" w:line="240" w:lineRule="auto"/>
+              <w:jc w:val="right"/>
+            </w:pPr>
+            <w:r>
+              <w:rPr>
+                <w:rFonts w:ascii="Times New Roman" w:hAnsi="Times New Roman" w:eastAsia="宋体"/>
+                <w:b w:val="0"/>
+                <w:sz w:val="28"/>
+              </w:rPr>
+              <w:t>所在学院：</w:t>
+            </w:r>
+          </w:p>
+        </w:tc>
+        <w:tc>
+          <w:tcPr>
+            <w:tcW w:type="dxa" w:w="5613"/>
+            <w:vAlign w:val="center"/>
+            <w:tcBorders>
+              <w:bottom w:val="single" w:sz="8" w:space="0" w:color="000000"/>
+            </w:tcBorders>
+          </w:tcPr>
+          <w:p>
+            <w:pPr>
+              <w:spacing w:before="0" w:after="0" w:line="240" w:lineRule="auto"/>
+              <w:jc w:val="center"/>
+            </w:pPr>
+            <w:r>
+              <w:rPr>
+                <w:rFonts w:ascii="Times New Roman" w:hAnsi="Times New Roman" w:eastAsia="宋体"/>
+                <w:b w:val="0"/>
+                <w:sz w:val="28"/>
+              </w:rPr>
+              <w:t>计算机科学与技术学院</w:t>
+            </w:r>
+          </w:p>
+        </w:tc>
+      </w:tr>
+      <w:tr>
+        <w:trPr>
+          <w:trHeight w:val="408" w:hRule="atLeast"/>
+        </w:trPr>
+        <w:tc>
+          <w:tcPr>
+            <w:tcW w:type="dxa" w:w="1757"/>
+            <w:vAlign w:val="center"/>
+          </w:tcPr>
+          <w:p>
+            <w:pPr>
+              <w:spacing w:before="0" w:after="0" w:line="240" w:lineRule="auto"/>
+              <w:jc w:val="right"/>
+            </w:pPr>
+            <w:r>
+              <w:rPr>
+                <w:rFonts w:ascii="Times New Roman" w:hAnsi="Times New Roman" w:eastAsia="宋体"/>
+                <w:b w:val="0"/>
+                <w:sz w:val="28"/>
+              </w:rPr>
+              <w:t>班　　级：</w:t>
+            </w:r>
+          </w:p>
+        </w:tc>
+        <w:tc>
+          <w:tcPr>
+            <w:tcW w:type="dxa" w:w="5613"/>
+            <w:vAlign w:val="center"/>
+            <w:tcBorders>
+              <w:bottom w:val="single" w:sz="8" w:space="0" w:color="000000"/>
+            </w:tcBorders>
+          </w:tcPr>
+          <w:p>
+            <w:pPr>
+              <w:spacing w:before="0" w:after="0" w:line="240" w:lineRule="auto"/>
+              <w:jc w:val="center"/>
+            </w:pPr>
+            <w:r>
+              <w:rPr>
+                <w:rFonts w:ascii="Times New Roman" w:hAnsi="Times New Roman" w:eastAsia="宋体"/>
+                <w:b w:val="0"/>
+                <w:sz w:val="28"/>
+              </w:rPr>
+            </w:r>
+          </w:p>
+        </w:tc>
+      </w:tr>
+      <w:tr>
+        <w:trPr>
+          <w:trHeight w:val="408" w:hRule="atLeast"/>
+        </w:trPr>
+        <w:tc>
+          <w:tcPr>
+            <w:tcW w:type="dxa" w:w="1757"/>
+            <w:vAlign w:val="center"/>
+          </w:tcPr>
+          <w:p>
+            <w:pPr>
+              <w:spacing w:before="0" w:after="0" w:line="240" w:lineRule="auto"/>
+              <w:jc w:val="right"/>
+            </w:pPr>
+            <w:r>
+              <w:rPr>
+                <w:rFonts w:ascii="Times New Roman" w:hAnsi="Times New Roman" w:eastAsia="宋体"/>
+                <w:b w:val="0"/>
+                <w:sz w:val="28"/>
+              </w:rPr>
+              <w:t>指导教师：</w:t>
+            </w:r>
+          </w:p>
+        </w:tc>
+        <w:tc>
+          <w:tcPr>
+            <w:tcW w:type="dxa" w:w="5613"/>
+            <w:vAlign w:val="center"/>
+            <w:tcBorders>
+              <w:bottom w:val="single" w:sz="8" w:space="0" w:color="000000"/>
+            </w:tcBorders>
+          </w:tcPr>
+          <w:p>
+            <w:pPr>
+              <w:spacing w:before="0" w:after="0" w:line="240" w:lineRule="auto"/>
+              <w:jc w:val="center"/>
+            </w:pPr>
+            <w:r>
+              <w:rPr>
+                <w:rFonts w:ascii="Times New Roman" w:hAnsi="Times New Roman" w:eastAsia="宋体"/>
+                <w:b w:val="0"/>
+                <w:sz w:val="28"/>
+              </w:rPr>
+              <w:t>买合木提·买买提</w:t>
+            </w:r>
+          </w:p>
+        </w:tc>
+      </w:tr>
+      <w:tr>
+        <w:trPr>
+          <w:trHeight w:val="408" w:hRule="atLeast"/>
+        </w:trPr>
+        <w:tc>
+          <w:tcPr>
+            <w:tcW w:type="dxa" w:w="1757"/>
+            <w:vAlign w:val="center"/>
+          </w:tcPr>
+          <w:p>
+            <w:pPr>
+              <w:spacing w:before="0" w:after="0" w:line="240" w:lineRule="auto"/>
+              <w:jc w:val="right"/>
+            </w:pPr>
+            <w:r>
+              <w:rPr>
+                <w:rFonts w:ascii="Times New Roman" w:hAnsi="Times New Roman" w:eastAsia="宋体"/>
+                <w:b w:val="0"/>
+                <w:sz w:val="28"/>
+              </w:rPr>
+              <w:t>职　　称：</w:t>
+            </w:r>
+          </w:p>
+        </w:tc>
+        <w:tc>
+          <w:tcPr>
+            <w:tcW w:type="dxa" w:w="5613"/>
+            <w:vAlign w:val="center"/>
+            <w:tcBorders>
+              <w:bottom w:val="single" w:sz="8" w:space="0" w:color="000000"/>
+            </w:tcBorders>
+          </w:tcPr>
+          <w:p>
+            <w:pPr>
+              <w:spacing w:before="0" w:after="0" w:line="240" w:lineRule="auto"/>
+              <w:jc w:val="center"/>
+            </w:pPr>
+            <w:r>
+              <w:rPr>
+                <w:rFonts w:ascii="Times New Roman" w:hAnsi="Times New Roman" w:eastAsia="宋体"/>
+                <w:b w:val="0"/>
+                <w:sz w:val="28"/>
+              </w:rPr>
+              <w:t>高级实验师</w:t>
+            </w:r>
+          </w:p>
+        </w:tc>
+      </w:tr>
+    </w:tbl>
     <w:p>
       <w:pPr>
         <w:spacing w:line="360" w:lineRule="auto"/>
@@ -1474,6 +1620,11 @@
         </w:tc>
       </w:tr>
     </w:tbl>
+    <w:p>
+      <w:r>
+        <w:br w:type="page"/>
+      </w:r>
+    </w:p>
     <w:p>
       <w:pPr>
         <w:jc w:val="center"/>

</xml_diff>

<commit_message>
docs: write system development plan
</commit_message>
<xml_diff>
--- a/docs/course-design/赵文彪-飞跃.docx
+++ b/docs/course-design/赵文彪-飞跃.docx
@@ -10790,233 +10790,1886 @@
     <w:p>
       <w:pPr>
         <w:pStyle w:val="Heading2"/>
-      </w:pPr>
-      <w:r>
-        <w:t>1 引言</w:t>
-      </w:r>
-    </w:p>
-    <w:p>
-      <w:pPr>
-        <w:spacing w:line="360" w:lineRule="auto"/>
-        <w:ind w:firstLineChars="200" w:firstLine="480"/>
+        <w:spacing w:before="240" w:after="120" w:line="276" w:lineRule="auto"/>
+        <w:jc w:val="left"/>
       </w:pPr>
       <w:r>
         <w:rPr>
           <w:rFonts w:ascii="Times New Roman" w:hAnsi="Times New Roman" w:eastAsia="宋体"/>
           <w:b w:val="0"/>
-          <w:color w:val="808080"/>
-          <w:sz w:val="24"/>
-          <w:u w:val="none"/>
+          <w:sz w:val="30"/>
         </w:rPr>
-        <w:t>【待填】编写目的、背景、定义、参考资料。</w:t>
+        <w:t>1 引言</w:t>
       </w:r>
     </w:p>
     <w:p>
       <w:pPr>
-        <w:pStyle w:val="Heading2"/>
-      </w:pPr>
-      <w:r>
-        <w:t>2 项目概述</w:t>
-      </w:r>
-    </w:p>
-    <w:p>
-      <w:pPr>
-        <w:pStyle w:val="Heading3"/>
-      </w:pPr>
-      <w:r>
-        <w:t>2.1 工作内容</w:t>
-      </w:r>
-    </w:p>
-    <w:p>
-      <w:pPr>
-        <w:pStyle w:val="Heading3"/>
-      </w:pPr>
-      <w:r>
-        <w:t>2.2 主要参加人员</w:t>
-      </w:r>
-    </w:p>
-    <w:p>
-      <w:pPr>
-        <w:pStyle w:val="Heading3"/>
-      </w:pPr>
-      <w:r>
-        <w:t>2.3 产品</w:t>
-      </w:r>
-    </w:p>
-    <w:p>
-      <w:pPr>
-        <w:spacing w:line="360" w:lineRule="auto"/>
-        <w:ind w:firstLineChars="200" w:firstLine="480"/>
+        <w:spacing w:before="0" w:after="0" w:line="360" w:lineRule="auto"/>
+        <w:jc w:val="left"/>
       </w:pPr>
       <w:r>
         <w:rPr>
           <w:rFonts w:ascii="Times New Roman" w:hAnsi="Times New Roman" w:eastAsia="宋体"/>
           <w:b w:val="0"/>
-          <w:color w:val="808080"/>
           <w:sz w:val="24"/>
-          <w:u w:val="none"/>
         </w:rPr>
-        <w:t>【待填】程序/文档/服务/非移交产品清单。</w:t>
+        <w:t>本系统开发计划用于明确新疆大学飞跃手册项目在课程周期内的开发顺序、人员分工、阶段产物、进度安排和支持条件。计划覆盖从开发环境熟悉、需求分析、概要设计、详细设计到编码实现与测试的全过程，作为后续章节编写、代码实现和验收检查的共同依据。</w:t>
       </w:r>
     </w:p>
     <w:p>
       <w:pPr>
-        <w:pStyle w:val="Heading3"/>
-      </w:pPr>
-      <w:r>
-        <w:t>2.4 验收标准</w:t>
-      </w:r>
-    </w:p>
-    <w:p>
-      <w:pPr>
-        <w:pStyle w:val="Heading3"/>
-      </w:pPr>
-      <w:r>
-        <w:t>2.5 完成项目的最迟期限</w:t>
-      </w:r>
-    </w:p>
-    <w:p>
-      <w:pPr>
-        <w:pStyle w:val="Heading3"/>
-      </w:pPr>
-      <w:r>
-        <w:t>2.6 本计划的批准者和批准日期</w:t>
-      </w:r>
-    </w:p>
-    <w:p>
-      <w:pPr>
-        <w:pStyle w:val="Heading2"/>
-      </w:pPr>
-      <w:r>
-        <w:t>3 实施计划</w:t>
-      </w:r>
-    </w:p>
-    <w:p>
-      <w:pPr>
-        <w:pStyle w:val="Heading3"/>
-      </w:pPr>
-      <w:r>
-        <w:t>3.1 工作任务的分解与人员分工</w:t>
-      </w:r>
-    </w:p>
-    <w:p>
-      <w:pPr>
-        <w:spacing w:line="360" w:lineRule="auto"/>
-        <w:ind w:firstLineChars="200" w:firstLine="480"/>
+        <w:spacing w:before="0" w:after="0" w:line="360" w:lineRule="auto"/>
+        <w:jc w:val="left"/>
       </w:pPr>
       <w:r>
         <w:rPr>
           <w:rFonts w:ascii="Times New Roman" w:hAnsi="Times New Roman" w:eastAsia="宋体"/>
           <w:b w:val="0"/>
-          <w:color w:val="808080"/>
           <w:sz w:val="24"/>
-          <w:u w:val="none"/>
         </w:rPr>
-        <w:t>【待填】按模块分解到人，建议用表格。</w:t>
+        <w:t>本计划中的 AI 开发工具主要指 CodeArts、Claude Code 等辅助编码与项目管理工具；Tailscale 指用于远程组网与设备互联的工具；tmux、ssh 自动化 AI 开发工作流指在远程会话中保持持续开发环境、执行命令和同步状态的工作方式；WSL 指 Windows Subsystem for Linux，用于在本地模拟服务器端部署与测试。</w:t>
       </w:r>
     </w:p>
     <w:p>
       <w:pPr>
-        <w:pStyle w:val="Heading3"/>
-      </w:pPr>
-      <w:r>
-        <w:t>3.2 接口人员</w:t>
-      </w:r>
-    </w:p>
-    <w:p>
-      <w:pPr>
-        <w:pStyle w:val="Heading3"/>
-      </w:pPr>
-      <w:r>
-        <w:t>3.3 进度</w:t>
-      </w:r>
-    </w:p>
-    <w:p>
-      <w:pPr>
-        <w:spacing w:line="360" w:lineRule="auto"/>
-        <w:ind w:firstLineChars="200" w:firstLine="480"/>
+        <w:pStyle w:val="Heading2"/>
+        <w:spacing w:before="240" w:after="120" w:line="276" w:lineRule="auto"/>
+        <w:jc w:val="left"/>
       </w:pPr>
       <w:r>
         <w:rPr>
           <w:rFonts w:ascii="Times New Roman" w:hAnsi="Times New Roman" w:eastAsia="宋体"/>
           <w:b w:val="0"/>
-          <w:color w:val="808080"/>
-          <w:sz w:val="24"/>
-          <w:u w:val="none"/>
+          <w:sz w:val="30"/>
         </w:rPr>
-        <w:t>【待填】甘特图或进度三线表（表 3-1）。</w:t>
+        <w:t>2 项目概述</w:t>
       </w:r>
     </w:p>
     <w:p>
       <w:pPr>
         <w:pStyle w:val="Heading3"/>
-      </w:pPr>
-      <w:r>
-        <w:t>3.4 预算</w:t>
-      </w:r>
-    </w:p>
-    <w:p>
-      <w:pPr>
-        <w:spacing w:line="360" w:lineRule="auto"/>
-        <w:ind w:firstLineChars="200" w:firstLine="480"/>
+        <w:spacing w:before="120" w:after="60" w:line="276" w:lineRule="auto"/>
+        <w:jc w:val="left"/>
       </w:pPr>
       <w:r>
         <w:rPr>
           <w:rFonts w:ascii="Times New Roman" w:hAnsi="Times New Roman" w:eastAsia="宋体"/>
           <w:b w:val="0"/>
-          <w:color w:val="808080"/>
-          <w:sz w:val="24"/>
-          <w:u w:val="none"/>
+          <w:sz w:val="28"/>
         </w:rPr>
-        <w:t>【待填】与第二章 6.1 口径一致。</w:t>
+        <w:t>2.1 工作内容</w:t>
       </w:r>
     </w:p>
     <w:p>
       <w:pPr>
-        <w:pStyle w:val="Heading3"/>
-      </w:pPr>
-      <w:r>
-        <w:t>3.5 关键问题</w:t>
+        <w:spacing w:before="0" w:after="0" w:line="360" w:lineRule="auto"/>
+        <w:jc w:val="left"/>
+      </w:pPr>
+      <w:r>
+        <w:rPr>
+          <w:rFonts w:ascii="Times New Roman" w:hAnsi="Times New Roman" w:eastAsia="宋体"/>
+          <w:b w:val="0"/>
+          <w:sz w:val="24"/>
+        </w:rPr>
+        <w:t>项目工作按时间顺序推进。2026 年 7 月 4 日，项目组集中熟悉 CodeArts、Claude Code 等 AI 开发工具，熟悉 Tailscale 远程组网工具，了解 tmux、ssh 自动化 AI 开发工作流，并在 WSL 本地环境模拟服务器端测试部署流程。2026 年 7 月 5 日至 7 月 6 日，项目组围绕四个业务模块并行完成需求分析、概要设计、详细设计、编码实现与测试材料整理。</w:t>
       </w:r>
     </w:p>
     <w:p>
       <w:pPr>
-        <w:pStyle w:val="Heading2"/>
-      </w:pPr>
-      <w:r>
-        <w:t>4 支持条件</w:t>
+        <w:spacing w:before="0" w:after="0" w:line="360" w:lineRule="auto"/>
+        <w:jc w:val="left"/>
+      </w:pPr>
+      <w:r>
+        <w:rPr>
+          <w:rFonts w:ascii="Times New Roman" w:hAnsi="Times New Roman" w:eastAsia="宋体"/>
+          <w:b w:val="0"/>
+          <w:sz w:val="24"/>
+        </w:rPr>
+        <w:t>四个业务模块分别为：笔记系统（写作、展示、评论、点赞）、资料库与教务学分自查、导师/院校库与 CCF 会议截稿、管理后台与鉴权/班级空间/小组协作。各模块均需形成第 4 章需求、第 5 章概要、第 6 章详细设计和第 7 章测试所需的图表、叙述表、核心代码和测试要点。</w:t>
       </w:r>
     </w:p>
     <w:p>
       <w:pPr>
         <w:pStyle w:val="Heading3"/>
-      </w:pPr>
-      <w:r>
-        <w:t>4.1 计算机系统支持</w:t>
+        <w:spacing w:before="120" w:after="60" w:line="276" w:lineRule="auto"/>
+        <w:jc w:val="left"/>
+      </w:pPr>
+      <w:r>
+        <w:rPr>
+          <w:rFonts w:ascii="Times New Roman" w:hAnsi="Times New Roman" w:eastAsia="宋体"/>
+          <w:b w:val="0"/>
+          <w:sz w:val="28"/>
+        </w:rPr>
+        <w:t>2.2 主要参加人员</w:t>
       </w:r>
     </w:p>
     <w:p>
       <w:pPr>
-        <w:pStyle w:val="Heading3"/>
-      </w:pPr>
-      <w:r>
-        <w:t>4.2 需由用户承担的工作</w:t>
+        <w:spacing w:before="0" w:after="0" w:line="360" w:lineRule="auto"/>
+        <w:jc w:val="left"/>
+      </w:pPr>
+      <w:r>
+        <w:rPr>
+          <w:rFonts w:ascii="Times New Roman" w:hAnsi="Times New Roman" w:eastAsia="宋体"/>
+          <w:b w:val="0"/>
+          <w:sz w:val="24"/>
+        </w:rPr>
+        <w:t>小组成员为：组长赵文彪；组员丁水悦、王艺婷、石建华、陶语涵（组员按姓氏笔画排序）。组长负责总体方案、开发工作流、模块集成、文档统稿与关键设计复核；组员按业务域分模块完成需求、设计、实现和测试材料。</w:t>
       </w:r>
     </w:p>
     <w:p>
       <w:pPr>
         <w:pStyle w:val="Heading3"/>
-      </w:pPr>
-      <w:r>
-        <w:t>4.3 由外单位提供的条件</w:t>
+        <w:spacing w:before="120" w:after="60" w:line="276" w:lineRule="auto"/>
+        <w:jc w:val="left"/>
+      </w:pPr>
+      <w:r>
+        <w:rPr>
+          <w:rFonts w:ascii="Times New Roman" w:hAnsi="Times New Roman" w:eastAsia="宋体"/>
+          <w:b w:val="0"/>
+          <w:sz w:val="28"/>
+        </w:rPr>
+        <w:t>2.3 产品</w:t>
       </w:r>
     </w:p>
     <w:p>
       <w:pPr>
+        <w:spacing w:before="0" w:after="0" w:line="360" w:lineRule="auto"/>
+        <w:jc w:val="left"/>
+      </w:pPr>
+      <w:r>
+        <w:rPr>
+          <w:rFonts w:ascii="Times New Roman" w:hAnsi="Times New Roman" w:eastAsia="宋体"/>
+          <w:b w:val="0"/>
+          <w:sz w:val="24"/>
+        </w:rPr>
+        <w:t>软件产品包括飞跃手册 Web 系统、后端 API 服务、数据库结构、浏览器端教务导入脚本或扩展、资料上传与预览能力、导师/会议只读数据挂载能力、管理后台与班级空间功能。文档产品包括需求分析、概要设计、详细设计、测试报告、用户操作手册、总结与附录材料。</w:t>
+      </w:r>
+    </w:p>
+    <w:p>
+      <w:pPr>
+        <w:spacing w:before="0" w:after="0" w:line="360" w:lineRule="auto"/>
+        <w:jc w:val="left"/>
+      </w:pPr>
+      <w:r>
+        <w:rPr>
+          <w:rFonts w:ascii="Times New Roman" w:hAnsi="Times New Roman" w:eastAsia="宋体"/>
+          <w:b w:val="0"/>
+          <w:sz w:val="24"/>
+        </w:rPr>
+        <w:t>不作为独立移交产品的内容包括临时调试脚本、本地缓存、个人开发环境配置和仅用于一次性验证的中间数据。</w:t>
+      </w:r>
+    </w:p>
+    <w:p>
+      <w:pPr>
+        <w:pStyle w:val="Heading3"/>
+        <w:spacing w:before="120" w:after="60" w:line="276" w:lineRule="auto"/>
+        <w:jc w:val="left"/>
+      </w:pPr>
+      <w:r>
+        <w:rPr>
+          <w:rFonts w:ascii="Times New Roman" w:hAnsi="Times New Roman" w:eastAsia="宋体"/>
+          <w:b w:val="0"/>
+          <w:sz w:val="28"/>
+        </w:rPr>
+        <w:t>2.4 验收标准</w:t>
+      </w:r>
+    </w:p>
+    <w:p>
+      <w:pPr>
+        <w:spacing w:before="0" w:after="0" w:line="360" w:lineRule="auto"/>
+        <w:jc w:val="left"/>
+      </w:pPr>
+      <w:r>
+        <w:rPr>
+          <w:rFonts w:ascii="Times New Roman" w:hAnsi="Times New Roman" w:eastAsia="宋体"/>
+          <w:b w:val="0"/>
+          <w:sz w:val="24"/>
+        </w:rPr>
+        <w:t>验收标准包括：核心页面可访问，主要业务流程可演示；四个模块均完成需求用例、数据流图或用例图、概要设计说明、详细设计图和测试用例；关键安全要求得到体现，包括成绩单 PDF 不落服务器、上传文件白名单与魔数校验、用户权限控制和 AI 调用降级；课程文档中的图表、代码片段和测试说明与实际模块保持一致。</w:t>
+      </w:r>
+    </w:p>
+    <w:p>
+      <w:pPr>
+        <w:pStyle w:val="Heading3"/>
+        <w:spacing w:before="120" w:after="60" w:line="276" w:lineRule="auto"/>
+        <w:jc w:val="left"/>
+      </w:pPr>
+      <w:r>
+        <w:rPr>
+          <w:rFonts w:ascii="Times New Roman" w:hAnsi="Times New Roman" w:eastAsia="宋体"/>
+          <w:b w:val="0"/>
+          <w:sz w:val="28"/>
+        </w:rPr>
+        <w:t>2.5 完成项目的最迟期限</w:t>
+      </w:r>
+    </w:p>
+    <w:p>
+      <w:pPr>
+        <w:spacing w:before="0" w:after="0" w:line="360" w:lineRule="auto"/>
+        <w:jc w:val="left"/>
+      </w:pPr>
+      <w:r>
+        <w:rPr>
+          <w:rFonts w:ascii="Times New Roman" w:hAnsi="Times New Roman" w:eastAsia="宋体"/>
+          <w:b w:val="0"/>
+          <w:sz w:val="24"/>
+        </w:rPr>
+        <w:t>项目核心开发、测试和模块文档计划于 2026 年 7 月 6 日完成；课程论文、目录更新、排版检查和提交材料计划于 2026 年 7 月 9 日前完成。</w:t>
+      </w:r>
+    </w:p>
+    <w:p>
+      <w:pPr>
+        <w:pStyle w:val="Heading3"/>
+        <w:spacing w:before="120" w:after="60" w:line="276" w:lineRule="auto"/>
+        <w:jc w:val="left"/>
+      </w:pPr>
+      <w:r>
+        <w:rPr>
+          <w:rFonts w:ascii="Times New Roman" w:hAnsi="Times New Roman" w:eastAsia="宋体"/>
+          <w:b w:val="0"/>
+          <w:sz w:val="28"/>
+        </w:rPr>
+        <w:t>2.6 本计划的批准者和批准日期</w:t>
+      </w:r>
+    </w:p>
+    <w:p>
+      <w:pPr>
+        <w:spacing w:before="0" w:after="0" w:line="360" w:lineRule="auto"/>
+        <w:jc w:val="left"/>
+      </w:pPr>
+      <w:r>
+        <w:rPr>
+          <w:rFonts w:ascii="Times New Roman" w:hAnsi="Times New Roman" w:eastAsia="宋体"/>
+          <w:b w:val="0"/>
+          <w:sz w:val="24"/>
+        </w:rPr>
+        <w:t>本计划由项目组制定，组长赵文彪负责执行跟踪，指导教师买合木提·买买提审阅。计划制定日期为 2026 年 7 月 4 日。</w:t>
+      </w:r>
+    </w:p>
+    <w:p>
+      <w:pPr>
         <w:pStyle w:val="Heading2"/>
-      </w:pPr>
-      <w:r>
+        <w:spacing w:before="240" w:after="120" w:line="276" w:lineRule="auto"/>
+        <w:jc w:val="left"/>
+      </w:pPr>
+      <w:r>
+        <w:rPr>
+          <w:rFonts w:ascii="Times New Roman" w:hAnsi="Times New Roman" w:eastAsia="宋体"/>
+          <w:b w:val="0"/>
+          <w:sz w:val="30"/>
+        </w:rPr>
+        <w:t>3 实施计划</w:t>
+      </w:r>
+    </w:p>
+    <w:p>
+      <w:pPr>
+        <w:pStyle w:val="Heading3"/>
+        <w:spacing w:before="120" w:after="60" w:line="276" w:lineRule="auto"/>
+        <w:jc w:val="left"/>
+      </w:pPr>
+      <w:r>
+        <w:rPr>
+          <w:rFonts w:ascii="Times New Roman" w:hAnsi="Times New Roman" w:eastAsia="宋体"/>
+          <w:b w:val="0"/>
+          <w:sz w:val="28"/>
+        </w:rPr>
+        <w:t>3.1 工作任务的分解与人员分工</w:t>
+      </w:r>
+    </w:p>
+    <w:p>
+      <w:pPr>
+        <w:spacing w:before="0" w:after="0" w:line="360" w:lineRule="auto"/>
+        <w:jc w:val="left"/>
+      </w:pPr>
+      <w:r>
+        <w:rPr>
+          <w:rFonts w:ascii="Times New Roman" w:hAnsi="Times New Roman" w:eastAsia="宋体"/>
+          <w:b w:val="0"/>
+          <w:sz w:val="24"/>
+        </w:rPr>
+        <w:t>模块分工遵循“业务域负责、组长统筹复核”的原则。第 5 章概要设计中涉及功能-程序映射、物理结构和 E-R 图的部分，因课程复习覆盖有限，先由各模块负责人形成初稿，再由组长统一复核，保证术语、图例、数据表和接口边界一致。</w:t>
+      </w:r>
+    </w:p>
+    <w:p>
+      <w:pPr>
+        <w:pStyle w:val="表题"/>
+        <w:spacing w:before="120" w:after="60" w:line="276" w:lineRule="auto"/>
+        <w:jc w:val="center"/>
+      </w:pPr>
+      <w:r>
+        <w:rPr>
+          <w:rFonts w:ascii="Times New Roman" w:hAnsi="Times New Roman" w:eastAsia="宋体"/>
+          <w:b/>
+          <w:sz w:val="21"/>
+        </w:rPr>
+        <w:t>表3-1　模块分工与文档产出</w:t>
+      </w:r>
+    </w:p>
+    <w:tbl>
+      <w:tblPr>
+        <w:tblW w:type="dxa" w:w="8312"/>
+        <w:tblLayout w:type="fixed"/>
+        <w:tblLook w:firstColumn="1" w:firstRow="1" w:lastColumn="0" w:lastRow="0" w:noHBand="0" w:noVBand="1" w:val="04A0"/>
+        <w:tblBorders>
+          <w:top w:val="single" w:sz="12" w:color="000000"/>
+          <w:bottom w:val="single" w:sz="12" w:color="000000"/>
+          <w:left w:val="nil"/>
+          <w:right w:val="nil"/>
+          <w:insideH w:val="nil"/>
+          <w:insideV w:val="nil"/>
+        </w:tblBorders>
+      </w:tblPr>
+      <w:tblGrid>
+        <w:gridCol w:w="831"/>
+        <w:gridCol w:w="1912"/>
+        <w:gridCol w:w="1829"/>
+        <w:gridCol w:w="2494"/>
+        <w:gridCol w:w="1246"/>
+      </w:tblGrid>
+      <w:tr>
+        <w:trPr>
+          <w:trHeight w:val="430" w:hRule="atLeast"/>
+        </w:trPr>
+        <w:tc>
+          <w:tcPr>
+            <w:tcW w:type="dxa" w:w="831"/>
+            <w:tcMar>
+              <w:top w:w="65" w:type="dxa"/>
+              <w:start w:w="80" w:type="dxa"/>
+              <w:bottom w:w="65" w:type="dxa"/>
+              <w:end w:w="80" w:type="dxa"/>
+            </w:tcMar>
+            <w:vAlign w:val="center"/>
+            <w:shd w:fill="EDEDED" w:val="clear"/>
+            <w:tcBorders>
+              <w:bottom w:val="single" w:sz="8" w:color="000000" w:space="0"/>
+            </w:tcBorders>
+          </w:tcPr>
+          <w:p>
+            <w:pPr>
+              <w:spacing w:before="0" w:after="0" w:line="276" w:lineRule="auto"/>
+              <w:jc w:val="center"/>
+            </w:pPr>
+            <w:r>
+              <w:rPr>
+                <w:rFonts w:ascii="Times New Roman" w:hAnsi="Times New Roman" w:eastAsia="宋体"/>
+                <w:b/>
+                <w:sz w:val="21"/>
+              </w:rPr>
+              <w:t>负责人</w:t>
+            </w:r>
+          </w:p>
+        </w:tc>
+        <w:tc>
+          <w:tcPr>
+            <w:tcW w:type="dxa" w:w="1912"/>
+            <w:tcMar>
+              <w:top w:w="65" w:type="dxa"/>
+              <w:start w:w="80" w:type="dxa"/>
+              <w:bottom w:w="65" w:type="dxa"/>
+              <w:end w:w="80" w:type="dxa"/>
+            </w:tcMar>
+            <w:vAlign w:val="center"/>
+            <w:shd w:fill="EDEDED" w:val="clear"/>
+            <w:tcBorders>
+              <w:bottom w:val="single" w:sz="8" w:color="000000" w:space="0"/>
+            </w:tcBorders>
+          </w:tcPr>
+          <w:p>
+            <w:pPr>
+              <w:spacing w:before="0" w:after="0" w:line="276" w:lineRule="auto"/>
+              <w:jc w:val="center"/>
+            </w:pPr>
+            <w:r>
+              <w:rPr>
+                <w:rFonts w:ascii="Times New Roman" w:hAnsi="Times New Roman" w:eastAsia="宋体"/>
+                <w:b/>
+                <w:sz w:val="21"/>
+              </w:rPr>
+              <w:t>模块域</w:t>
+            </w:r>
+          </w:p>
+        </w:tc>
+        <w:tc>
+          <w:tcPr>
+            <w:tcW w:type="dxa" w:w="1829"/>
+            <w:tcMar>
+              <w:top w:w="65" w:type="dxa"/>
+              <w:start w:w="80" w:type="dxa"/>
+              <w:bottom w:w="65" w:type="dxa"/>
+              <w:end w:w="80" w:type="dxa"/>
+            </w:tcMar>
+            <w:vAlign w:val="center"/>
+            <w:shd w:fill="EDEDED" w:val="clear"/>
+            <w:tcBorders>
+              <w:bottom w:val="single" w:sz="8" w:color="000000" w:space="0"/>
+            </w:tcBorders>
+          </w:tcPr>
+          <w:p>
+            <w:pPr>
+              <w:spacing w:before="0" w:after="0" w:line="276" w:lineRule="auto"/>
+              <w:jc w:val="center"/>
+            </w:pPr>
+            <w:r>
+              <w:rPr>
+                <w:rFonts w:ascii="Times New Roman" w:hAnsi="Times New Roman" w:eastAsia="宋体"/>
+                <w:b/>
+                <w:sz w:val="21"/>
+              </w:rPr>
+              <w:t>需求产出</w:t>
+            </w:r>
+          </w:p>
+        </w:tc>
+        <w:tc>
+          <w:tcPr>
+            <w:tcW w:type="dxa" w:w="2494"/>
+            <w:tcMar>
+              <w:top w:w="65" w:type="dxa"/>
+              <w:start w:w="80" w:type="dxa"/>
+              <w:bottom w:w="65" w:type="dxa"/>
+              <w:end w:w="80" w:type="dxa"/>
+            </w:tcMar>
+            <w:vAlign w:val="center"/>
+            <w:shd w:fill="EDEDED" w:val="clear"/>
+            <w:tcBorders>
+              <w:bottom w:val="single" w:sz="8" w:color="000000" w:space="0"/>
+            </w:tcBorders>
+          </w:tcPr>
+          <w:p>
+            <w:pPr>
+              <w:spacing w:before="0" w:after="0" w:line="276" w:lineRule="auto"/>
+              <w:jc w:val="center"/>
+            </w:pPr>
+            <w:r>
+              <w:rPr>
+                <w:rFonts w:ascii="Times New Roman" w:hAnsi="Times New Roman" w:eastAsia="宋体"/>
+                <w:b/>
+                <w:sz w:val="21"/>
+              </w:rPr>
+              <w:t>设计产出</w:t>
+            </w:r>
+          </w:p>
+        </w:tc>
+        <w:tc>
+          <w:tcPr>
+            <w:tcW w:type="dxa" w:w="1246"/>
+            <w:tcMar>
+              <w:top w:w="65" w:type="dxa"/>
+              <w:start w:w="80" w:type="dxa"/>
+              <w:bottom w:w="65" w:type="dxa"/>
+              <w:end w:w="80" w:type="dxa"/>
+            </w:tcMar>
+            <w:vAlign w:val="center"/>
+            <w:shd w:fill="EDEDED" w:val="clear"/>
+            <w:tcBorders>
+              <w:bottom w:val="single" w:sz="8" w:color="000000" w:space="0"/>
+            </w:tcBorders>
+          </w:tcPr>
+          <w:p>
+            <w:pPr>
+              <w:spacing w:before="0" w:after="0" w:line="276" w:lineRule="auto"/>
+              <w:jc w:val="center"/>
+            </w:pPr>
+            <w:r>
+              <w:rPr>
+                <w:rFonts w:ascii="Times New Roman" w:hAnsi="Times New Roman" w:eastAsia="宋体"/>
+                <w:b/>
+                <w:sz w:val="21"/>
+              </w:rPr>
+              <w:t>测试重点</w:t>
+            </w:r>
+          </w:p>
+        </w:tc>
+      </w:tr>
+      <w:tr>
+        <w:trPr>
+          <w:trHeight w:val="430" w:hRule="atLeast"/>
+        </w:trPr>
+        <w:tc>
+          <w:tcPr>
+            <w:tcW w:type="dxa" w:w="831"/>
+            <w:tcMar>
+              <w:top w:w="65" w:type="dxa"/>
+              <w:start w:w="80" w:type="dxa"/>
+              <w:bottom w:w="65" w:type="dxa"/>
+              <w:end w:w="80" w:type="dxa"/>
+            </w:tcMar>
+            <w:vAlign w:val="center"/>
+          </w:tcPr>
+          <w:p>
+            <w:pPr>
+              <w:spacing w:before="0" w:after="0" w:line="276" w:lineRule="auto"/>
+              <w:jc w:val="center"/>
+            </w:pPr>
+            <w:r>
+              <w:rPr>
+                <w:rFonts w:ascii="Times New Roman" w:hAnsi="Times New Roman" w:eastAsia="宋体"/>
+                <w:sz w:val="21"/>
+              </w:rPr>
+              <w:t>赵文彪</w:t>
+            </w:r>
+          </w:p>
+        </w:tc>
+        <w:tc>
+          <w:tcPr>
+            <w:tcW w:type="dxa" w:w="1912"/>
+            <w:tcMar>
+              <w:top w:w="65" w:type="dxa"/>
+              <w:start w:w="80" w:type="dxa"/>
+              <w:bottom w:w="65" w:type="dxa"/>
+              <w:end w:w="80" w:type="dxa"/>
+            </w:tcMar>
+            <w:vAlign w:val="center"/>
+          </w:tcPr>
+          <w:p>
+            <w:pPr>
+              <w:spacing w:before="0" w:after="0" w:line="276" w:lineRule="auto"/>
+              <w:jc w:val="left"/>
+            </w:pPr>
+            <w:r>
+              <w:rPr>
+                <w:rFonts w:ascii="Times New Roman" w:hAnsi="Times New Roman" w:eastAsia="宋体"/>
+                <w:sz w:val="21"/>
+              </w:rPr>
+              <w:t>统筹集成与开发工作流</w:t>
+            </w:r>
+          </w:p>
+        </w:tc>
+        <w:tc>
+          <w:tcPr>
+            <w:tcW w:type="dxa" w:w="1829"/>
+            <w:tcMar>
+              <w:top w:w="65" w:type="dxa"/>
+              <w:start w:w="80" w:type="dxa"/>
+              <w:bottom w:w="65" w:type="dxa"/>
+              <w:end w:w="80" w:type="dxa"/>
+            </w:tcMar>
+            <w:vAlign w:val="center"/>
+          </w:tcPr>
+          <w:p>
+            <w:pPr>
+              <w:spacing w:before="0" w:after="0" w:line="276" w:lineRule="auto"/>
+              <w:jc w:val="left"/>
+            </w:pPr>
+            <w:r>
+              <w:rPr>
+                <w:rFonts w:ascii="Times New Roman" w:hAnsi="Times New Roman" w:eastAsia="宋体"/>
+                <w:sz w:val="21"/>
+              </w:rPr>
+              <w:t>总需求边界、进度与接口协调</w:t>
+            </w:r>
+          </w:p>
+        </w:tc>
+        <w:tc>
+          <w:tcPr>
+            <w:tcW w:type="dxa" w:w="2494"/>
+            <w:tcMar>
+              <w:top w:w="65" w:type="dxa"/>
+              <w:start w:w="80" w:type="dxa"/>
+              <w:bottom w:w="65" w:type="dxa"/>
+              <w:end w:w="80" w:type="dxa"/>
+            </w:tcMar>
+            <w:vAlign w:val="center"/>
+          </w:tcPr>
+          <w:p>
+            <w:pPr>
+              <w:spacing w:before="0" w:after="0" w:line="276" w:lineRule="auto"/>
+              <w:jc w:val="left"/>
+            </w:pPr>
+            <w:r>
+              <w:rPr>
+                <w:rFonts w:ascii="Times New Roman" w:hAnsi="Times New Roman" w:eastAsia="宋体"/>
+                <w:sz w:val="21"/>
+              </w:rPr>
+              <w:t>全局结构复核、文档统稿、部署方案</w:t>
+            </w:r>
+          </w:p>
+        </w:tc>
+        <w:tc>
+          <w:tcPr>
+            <w:tcW w:type="dxa" w:w="1246"/>
+            <w:tcMar>
+              <w:top w:w="65" w:type="dxa"/>
+              <w:start w:w="80" w:type="dxa"/>
+              <w:bottom w:w="65" w:type="dxa"/>
+              <w:end w:w="80" w:type="dxa"/>
+            </w:tcMar>
+            <w:vAlign w:val="center"/>
+          </w:tcPr>
+          <w:p>
+            <w:pPr>
+              <w:spacing w:before="0" w:after="0" w:line="276" w:lineRule="auto"/>
+              <w:jc w:val="left"/>
+            </w:pPr>
+            <w:r>
+              <w:rPr>
+                <w:rFonts w:ascii="Times New Roman" w:hAnsi="Times New Roman" w:eastAsia="宋体"/>
+                <w:sz w:val="21"/>
+              </w:rPr>
+              <w:t>集成演示、回归检查</w:t>
+            </w:r>
+          </w:p>
+        </w:tc>
+      </w:tr>
+      <w:tr>
+        <w:trPr>
+          <w:trHeight w:val="430" w:hRule="atLeast"/>
+        </w:trPr>
+        <w:tc>
+          <w:tcPr>
+            <w:tcW w:type="dxa" w:w="831"/>
+            <w:tcMar>
+              <w:top w:w="65" w:type="dxa"/>
+              <w:start w:w="80" w:type="dxa"/>
+              <w:bottom w:w="65" w:type="dxa"/>
+              <w:end w:w="80" w:type="dxa"/>
+            </w:tcMar>
+            <w:vAlign w:val="center"/>
+          </w:tcPr>
+          <w:p>
+            <w:pPr>
+              <w:spacing w:before="0" w:after="0" w:line="276" w:lineRule="auto"/>
+              <w:jc w:val="center"/>
+            </w:pPr>
+            <w:r>
+              <w:rPr>
+                <w:rFonts w:ascii="Times New Roman" w:hAnsi="Times New Roman" w:eastAsia="宋体"/>
+                <w:sz w:val="21"/>
+              </w:rPr>
+              <w:t>陶语涵</w:t>
+            </w:r>
+          </w:p>
+        </w:tc>
+        <w:tc>
+          <w:tcPr>
+            <w:tcW w:type="dxa" w:w="1912"/>
+            <w:tcMar>
+              <w:top w:w="65" w:type="dxa"/>
+              <w:start w:w="80" w:type="dxa"/>
+              <w:bottom w:w="65" w:type="dxa"/>
+              <w:end w:w="80" w:type="dxa"/>
+            </w:tcMar>
+            <w:vAlign w:val="center"/>
+          </w:tcPr>
+          <w:p>
+            <w:pPr>
+              <w:spacing w:before="0" w:after="0" w:line="276" w:lineRule="auto"/>
+              <w:jc w:val="left"/>
+            </w:pPr>
+            <w:r>
+              <w:rPr>
+                <w:rFonts w:ascii="Times New Roman" w:hAnsi="Times New Roman" w:eastAsia="宋体"/>
+                <w:sz w:val="21"/>
+              </w:rPr>
+              <w:t>笔记系统、评论点赞</w:t>
+            </w:r>
+          </w:p>
+        </w:tc>
+        <w:tc>
+          <w:tcPr>
+            <w:tcW w:type="dxa" w:w="1829"/>
+            <w:tcMar>
+              <w:top w:w="65" w:type="dxa"/>
+              <w:start w:w="80" w:type="dxa"/>
+              <w:bottom w:w="65" w:type="dxa"/>
+              <w:end w:w="80" w:type="dxa"/>
+            </w:tcMar>
+            <w:vAlign w:val="center"/>
+          </w:tcPr>
+          <w:p>
+            <w:pPr>
+              <w:spacing w:before="0" w:after="0" w:line="276" w:lineRule="auto"/>
+              <w:jc w:val="left"/>
+            </w:pPr>
+            <w:r>
+              <w:rPr>
+                <w:rFonts w:ascii="Times New Roman" w:hAnsi="Times New Roman" w:eastAsia="宋体"/>
+                <w:sz w:val="21"/>
+              </w:rPr>
+              <w:t>匿名访客、注册用户；7 个用例</w:t>
+            </w:r>
+          </w:p>
+        </w:tc>
+        <w:tc>
+          <w:tcPr>
+            <w:tcW w:type="dxa" w:w="2494"/>
+            <w:tcMar>
+              <w:top w:w="65" w:type="dxa"/>
+              <w:start w:w="80" w:type="dxa"/>
+              <w:bottom w:w="65" w:type="dxa"/>
+              <w:end w:w="80" w:type="dxa"/>
+            </w:tcMar>
+            <w:vAlign w:val="center"/>
+          </w:tcPr>
+          <w:p>
+            <w:pPr>
+              <w:spacing w:before="0" w:after="0" w:line="276" w:lineRule="auto"/>
+              <w:jc w:val="left"/>
+            </w:pPr>
+            <w:r>
+              <w:rPr>
+                <w:rFonts w:ascii="Times New Roman" w:hAnsi="Times New Roman" w:eastAsia="宋体"/>
+                <w:sz w:val="21"/>
+              </w:rPr>
+              <w:t>Note/Draft/Like/Comment；类图、顺序图、状态图</w:t>
+            </w:r>
+          </w:p>
+        </w:tc>
+        <w:tc>
+          <w:tcPr>
+            <w:tcW w:type="dxa" w:w="1246"/>
+            <w:tcMar>
+              <w:top w:w="65" w:type="dxa"/>
+              <w:start w:w="80" w:type="dxa"/>
+              <w:bottom w:w="65" w:type="dxa"/>
+              <w:end w:w="80" w:type="dxa"/>
+            </w:tcMar>
+            <w:vAlign w:val="center"/>
+          </w:tcPr>
+          <w:p>
+            <w:pPr>
+              <w:spacing w:before="0" w:after="0" w:line="276" w:lineRule="auto"/>
+              <w:jc w:val="left"/>
+            </w:pPr>
+            <w:r>
+              <w:rPr>
+                <w:rFonts w:ascii="Times New Roman" w:hAnsi="Times New Roman" w:eastAsia="宋体"/>
+                <w:sz w:val="21"/>
+              </w:rPr>
+              <w:t>发布路径、AI 降级、点赞幂等</w:t>
+            </w:r>
+          </w:p>
+        </w:tc>
+      </w:tr>
+      <w:tr>
+        <w:trPr>
+          <w:trHeight w:val="430" w:hRule="atLeast"/>
+        </w:trPr>
+        <w:tc>
+          <w:tcPr>
+            <w:tcW w:type="dxa" w:w="831"/>
+            <w:tcMar>
+              <w:top w:w="65" w:type="dxa"/>
+              <w:start w:w="80" w:type="dxa"/>
+              <w:bottom w:w="65" w:type="dxa"/>
+              <w:end w:w="80" w:type="dxa"/>
+            </w:tcMar>
+            <w:vAlign w:val="center"/>
+          </w:tcPr>
+          <w:p>
+            <w:pPr>
+              <w:spacing w:before="0" w:after="0" w:line="276" w:lineRule="auto"/>
+              <w:jc w:val="center"/>
+            </w:pPr>
+            <w:r>
+              <w:rPr>
+                <w:rFonts w:ascii="Times New Roman" w:hAnsi="Times New Roman" w:eastAsia="宋体"/>
+                <w:sz w:val="21"/>
+              </w:rPr>
+              <w:t>丁水悦</w:t>
+            </w:r>
+          </w:p>
+        </w:tc>
+        <w:tc>
+          <w:tcPr>
+            <w:tcW w:type="dxa" w:w="1912"/>
+            <w:tcMar>
+              <w:top w:w="65" w:type="dxa"/>
+              <w:start w:w="80" w:type="dxa"/>
+              <w:bottom w:w="65" w:type="dxa"/>
+              <w:end w:w="80" w:type="dxa"/>
+            </w:tcMar>
+            <w:vAlign w:val="center"/>
+          </w:tcPr>
+          <w:p>
+            <w:pPr>
+              <w:spacing w:before="0" w:after="0" w:line="276" w:lineRule="auto"/>
+              <w:jc w:val="left"/>
+            </w:pPr>
+            <w:r>
+              <w:rPr>
+                <w:rFonts w:ascii="Times New Roman" w:hAnsi="Times New Roman" w:eastAsia="宋体"/>
+                <w:sz w:val="21"/>
+              </w:rPr>
+              <w:t>资料库、教务学分自查</w:t>
+            </w:r>
+          </w:p>
+        </w:tc>
+        <w:tc>
+          <w:tcPr>
+            <w:tcW w:type="dxa" w:w="1829"/>
+            <w:tcMar>
+              <w:top w:w="65" w:type="dxa"/>
+              <w:start w:w="80" w:type="dxa"/>
+              <w:bottom w:w="65" w:type="dxa"/>
+              <w:end w:w="80" w:type="dxa"/>
+            </w:tcMar>
+            <w:vAlign w:val="center"/>
+          </w:tcPr>
+          <w:p>
+            <w:pPr>
+              <w:spacing w:before="0" w:after="0" w:line="276" w:lineRule="auto"/>
+              <w:jc w:val="left"/>
+            </w:pPr>
+            <w:r>
+              <w:rPr>
+                <w:rFonts w:ascii="Times New Roman" w:hAnsi="Times New Roman" w:eastAsia="宋体"/>
+                <w:sz w:val="21"/>
+              </w:rPr>
+              <w:t>注册用户、管理员；8 个用例</w:t>
+            </w:r>
+          </w:p>
+        </w:tc>
+        <w:tc>
+          <w:tcPr>
+            <w:tcW w:type="dxa" w:w="2494"/>
+            <w:tcMar>
+              <w:top w:w="65" w:type="dxa"/>
+              <w:start w:w="80" w:type="dxa"/>
+              <w:bottom w:w="65" w:type="dxa"/>
+              <w:end w:w="80" w:type="dxa"/>
+            </w:tcMar>
+            <w:vAlign w:val="center"/>
+          </w:tcPr>
+          <w:p>
+            <w:pPr>
+              <w:spacing w:before="0" w:after="0" w:line="276" w:lineRule="auto"/>
+              <w:jc w:val="left"/>
+            </w:pPr>
+            <w:r>
+              <w:rPr>
+                <w:rFonts w:ascii="Times New Roman" w:hAnsi="Times New Roman" w:eastAsia="宋体"/>
+                <w:sz w:val="21"/>
+              </w:rPr>
+              <w:t>MaterialResource/File/Notice；上传与成绩单流程</w:t>
+            </w:r>
+          </w:p>
+        </w:tc>
+        <w:tc>
+          <w:tcPr>
+            <w:tcW w:type="dxa" w:w="1246"/>
+            <w:tcMar>
+              <w:top w:w="65" w:type="dxa"/>
+              <w:start w:w="80" w:type="dxa"/>
+              <w:bottom w:w="65" w:type="dxa"/>
+              <w:end w:w="80" w:type="dxa"/>
+            </w:tcMar>
+            <w:vAlign w:val="center"/>
+          </w:tcPr>
+          <w:p>
+            <w:pPr>
+              <w:spacing w:before="0" w:after="0" w:line="276" w:lineRule="auto"/>
+              <w:jc w:val="left"/>
+            </w:pPr>
+            <w:r>
+              <w:rPr>
+                <w:rFonts w:ascii="Times New Roman" w:hAnsi="Times New Roman" w:eastAsia="宋体"/>
+                <w:sz w:val="21"/>
+              </w:rPr>
+              <w:t>50MB、魔数、PDF 不落盘、owner 权限</w:t>
+            </w:r>
+          </w:p>
+        </w:tc>
+      </w:tr>
+      <w:tr>
+        <w:trPr>
+          <w:trHeight w:val="430" w:hRule="atLeast"/>
+        </w:trPr>
+        <w:tc>
+          <w:tcPr>
+            <w:tcW w:type="dxa" w:w="831"/>
+            <w:tcMar>
+              <w:top w:w="65" w:type="dxa"/>
+              <w:start w:w="80" w:type="dxa"/>
+              <w:bottom w:w="65" w:type="dxa"/>
+              <w:end w:w="80" w:type="dxa"/>
+            </w:tcMar>
+            <w:vAlign w:val="center"/>
+          </w:tcPr>
+          <w:p>
+            <w:pPr>
+              <w:spacing w:before="0" w:after="0" w:line="276" w:lineRule="auto"/>
+              <w:jc w:val="center"/>
+            </w:pPr>
+            <w:r>
+              <w:rPr>
+                <w:rFonts w:ascii="Times New Roman" w:hAnsi="Times New Roman" w:eastAsia="宋体"/>
+                <w:sz w:val="21"/>
+              </w:rPr>
+              <w:t>王艺婷</w:t>
+            </w:r>
+          </w:p>
+        </w:tc>
+        <w:tc>
+          <w:tcPr>
+            <w:tcW w:type="dxa" w:w="1912"/>
+            <w:tcMar>
+              <w:top w:w="65" w:type="dxa"/>
+              <w:start w:w="80" w:type="dxa"/>
+              <w:bottom w:w="65" w:type="dxa"/>
+              <w:end w:w="80" w:type="dxa"/>
+            </w:tcMar>
+            <w:vAlign w:val="center"/>
+          </w:tcPr>
+          <w:p>
+            <w:pPr>
+              <w:spacing w:before="0" w:after="0" w:line="276" w:lineRule="auto"/>
+              <w:jc w:val="left"/>
+            </w:pPr>
+            <w:r>
+              <w:rPr>
+                <w:rFonts w:ascii="Times New Roman" w:hAnsi="Times New Roman" w:eastAsia="宋体"/>
+                <w:sz w:val="21"/>
+              </w:rPr>
+              <w:t>导师/院校库、CCF 会议</w:t>
+            </w:r>
+          </w:p>
+        </w:tc>
+        <w:tc>
+          <w:tcPr>
+            <w:tcW w:type="dxa" w:w="1829"/>
+            <w:tcMar>
+              <w:top w:w="65" w:type="dxa"/>
+              <w:start w:w="80" w:type="dxa"/>
+              <w:bottom w:w="65" w:type="dxa"/>
+              <w:end w:w="80" w:type="dxa"/>
+            </w:tcMar>
+            <w:vAlign w:val="center"/>
+          </w:tcPr>
+          <w:p>
+            <w:pPr>
+              <w:spacing w:before="0" w:after="0" w:line="276" w:lineRule="auto"/>
+              <w:jc w:val="left"/>
+            </w:pPr>
+            <w:r>
+              <w:rPr>
+                <w:rFonts w:ascii="Times New Roman" w:hAnsi="Times New Roman" w:eastAsia="宋体"/>
+                <w:sz w:val="21"/>
+              </w:rPr>
+              <w:t>匿名访客、外部系统、管理员；7 个用例</w:t>
+            </w:r>
+          </w:p>
+        </w:tc>
+        <w:tc>
+          <w:tcPr>
+            <w:tcW w:type="dxa" w:w="2494"/>
+            <w:tcMar>
+              <w:top w:w="65" w:type="dxa"/>
+              <w:start w:w="80" w:type="dxa"/>
+              <w:bottom w:w="65" w:type="dxa"/>
+              <w:end w:w="80" w:type="dxa"/>
+            </w:tcMar>
+            <w:vAlign w:val="center"/>
+          </w:tcPr>
+          <w:p>
+            <w:pPr>
+              <w:spacing w:before="0" w:after="0" w:line="276" w:lineRule="auto"/>
+              <w:jc w:val="left"/>
+            </w:pPr>
+            <w:r>
+              <w:rPr>
+                <w:rFonts w:ascii="Times New Roman" w:hAnsi="Times New Roman" w:eastAsia="宋体"/>
+                <w:sz w:val="21"/>
+              </w:rPr>
+              <w:t>只读库模型、外部数据 E-R、爬取降级流程</w:t>
+            </w:r>
+          </w:p>
+        </w:tc>
+        <w:tc>
+          <w:tcPr>
+            <w:tcW w:type="dxa" w:w="1246"/>
+            <w:tcMar>
+              <w:top w:w="65" w:type="dxa"/>
+              <w:start w:w="80" w:type="dxa"/>
+              <w:bottom w:w="65" w:type="dxa"/>
+              <w:end w:w="80" w:type="dxa"/>
+            </w:tcMar>
+            <w:vAlign w:val="center"/>
+          </w:tcPr>
+          <w:p>
+            <w:pPr>
+              <w:spacing w:before="0" w:after="0" w:line="276" w:lineRule="auto"/>
+              <w:jc w:val="left"/>
+            </w:pPr>
+            <w:r>
+              <w:rPr>
+                <w:rFonts w:ascii="Times New Roman" w:hAnsi="Times New Roman" w:eastAsia="宋体"/>
+                <w:sz w:val="21"/>
+              </w:rPr>
+              <w:t>拼音/首字母/CJK、closed 终态、降级兜底</w:t>
+            </w:r>
+          </w:p>
+        </w:tc>
+      </w:tr>
+      <w:tr>
+        <w:trPr>
+          <w:trHeight w:val="430" w:hRule="atLeast"/>
+        </w:trPr>
+        <w:tc>
+          <w:tcPr>
+            <w:tcW w:type="dxa" w:w="831"/>
+            <w:tcMar>
+              <w:top w:w="65" w:type="dxa"/>
+              <w:start w:w="80" w:type="dxa"/>
+              <w:bottom w:w="65" w:type="dxa"/>
+              <w:end w:w="80" w:type="dxa"/>
+            </w:tcMar>
+            <w:vAlign w:val="center"/>
+          </w:tcPr>
+          <w:p>
+            <w:pPr>
+              <w:spacing w:before="0" w:after="0" w:line="276" w:lineRule="auto"/>
+              <w:jc w:val="center"/>
+            </w:pPr>
+            <w:r>
+              <w:rPr>
+                <w:rFonts w:ascii="Times New Roman" w:hAnsi="Times New Roman" w:eastAsia="宋体"/>
+                <w:sz w:val="21"/>
+              </w:rPr>
+              <w:t>石建华</w:t>
+            </w:r>
+          </w:p>
+        </w:tc>
+        <w:tc>
+          <w:tcPr>
+            <w:tcW w:type="dxa" w:w="1912"/>
+            <w:tcMar>
+              <w:top w:w="65" w:type="dxa"/>
+              <w:start w:w="80" w:type="dxa"/>
+              <w:bottom w:w="65" w:type="dxa"/>
+              <w:end w:w="80" w:type="dxa"/>
+            </w:tcMar>
+            <w:vAlign w:val="center"/>
+          </w:tcPr>
+          <w:p>
+            <w:pPr>
+              <w:spacing w:before="0" w:after="0" w:line="276" w:lineRule="auto"/>
+              <w:jc w:val="left"/>
+            </w:pPr>
+            <w:r>
+              <w:rPr>
+                <w:rFonts w:ascii="Times New Roman" w:hAnsi="Times New Roman" w:eastAsia="宋体"/>
+                <w:sz w:val="21"/>
+              </w:rPr>
+              <w:t>管理后台、鉴权、班级空间</w:t>
+            </w:r>
+          </w:p>
+        </w:tc>
+        <w:tc>
+          <w:tcPr>
+            <w:tcW w:type="dxa" w:w="1829"/>
+            <w:tcMar>
+              <w:top w:w="65" w:type="dxa"/>
+              <w:start w:w="80" w:type="dxa"/>
+              <w:bottom w:w="65" w:type="dxa"/>
+              <w:end w:w="80" w:type="dxa"/>
+            </w:tcMar>
+            <w:vAlign w:val="center"/>
+          </w:tcPr>
+          <w:p>
+            <w:pPr>
+              <w:spacing w:before="0" w:after="0" w:line="276" w:lineRule="auto"/>
+              <w:jc w:val="left"/>
+            </w:pPr>
+            <w:r>
+              <w:rPr>
+                <w:rFonts w:ascii="Times New Roman" w:hAnsi="Times New Roman" w:eastAsia="宋体"/>
+                <w:sz w:val="21"/>
+              </w:rPr>
+              <w:t>注册用户、管理员、超级管理员；7 个用例</w:t>
+            </w:r>
+          </w:p>
+        </w:tc>
+        <w:tc>
+          <w:tcPr>
+            <w:tcW w:type="dxa" w:w="2494"/>
+            <w:tcMar>
+              <w:top w:w="65" w:type="dxa"/>
+              <w:start w:w="80" w:type="dxa"/>
+              <w:bottom w:w="65" w:type="dxa"/>
+              <w:end w:w="80" w:type="dxa"/>
+            </w:tcMar>
+            <w:vAlign w:val="center"/>
+          </w:tcPr>
+          <w:p>
+            <w:pPr>
+              <w:spacing w:before="0" w:after="0" w:line="276" w:lineRule="auto"/>
+              <w:jc w:val="left"/>
+            </w:pPr>
+            <w:r>
+              <w:rPr>
+                <w:rFonts w:ascii="Times New Roman" w:hAnsi="Times New Roman" w:eastAsia="宋体"/>
+                <w:sz w:val="21"/>
+              </w:rPr>
+              <w:t>11 张 ORM 表、三级角色、班级/小组流程</w:t>
+            </w:r>
+          </w:p>
+        </w:tc>
+        <w:tc>
+          <w:tcPr>
+            <w:tcW w:type="dxa" w:w="1246"/>
+            <w:tcMar>
+              <w:top w:w="65" w:type="dxa"/>
+              <w:start w:w="80" w:type="dxa"/>
+              <w:bottom w:w="65" w:type="dxa"/>
+              <w:end w:w="80" w:type="dxa"/>
+            </w:tcMar>
+            <w:vAlign w:val="center"/>
+          </w:tcPr>
+          <w:p>
+            <w:pPr>
+              <w:spacing w:before="0" w:after="0" w:line="276" w:lineRule="auto"/>
+              <w:jc w:val="left"/>
+            </w:pPr>
+            <w:r>
+              <w:rPr>
+                <w:rFonts w:ascii="Times New Roman" w:hAnsi="Times New Roman" w:eastAsia="宋体"/>
+                <w:sz w:val="21"/>
+              </w:rPr>
+              <w:t>权限边界、一人一组、审批并发、硬删级联</w:t>
+            </w:r>
+          </w:p>
+        </w:tc>
+      </w:tr>
+    </w:tbl>
+    <w:p>
+      <w:pPr>
+        <w:spacing w:before="0" w:after="0" w:line="360" w:lineRule="auto"/>
+        <w:jc w:val="left"/>
+      </w:pPr>
+      <w:r>
+        <w:rPr>
+          <w:rFonts w:ascii="Times New Roman" w:hAnsi="Times New Roman" w:eastAsia="宋体"/>
+          <w:b w:val="0"/>
+          <w:sz w:val="24"/>
+        </w:rPr>
+        <w:t>陶语涵负责笔记系统（写作、展示、评论、点赞）。模块范围包括 /write 与 /browse：/write 负责草稿、自动保存、发布、AI 润色和简介生成；/browse 负责信息流、详情页、锚点评论和点赞。需求阶段设置匿名访客和注册用户两类参与者，编写 7 个用例，绘制 1 张模块用例图和 1 张功能级 DFD，重点描述“草稿发布”“AI 选段润色”“锚点评论”三个核心用例。概要设计阶段说明 notes、drafts、interactions、ai 路由及 services 的功能-程序映射，物理结构聚焦 Note、Draft、Like、Comment 四张表，重点说明 Comment 的 anchor 三字段和 Like 的复合主键，并绘制局部 E-R 图。详细设计阶段绘制 1 张类图，4 张顺序图（草稿发布与 AI 摘要降级、AI 选段润色与 diff 渲染、AI 简介 SSE 三层降级、锚点评论回跳），1 张笔记生命周期状态图，2 张活动图（列表排序/标签/游标分页、前端 AI 流式三层降级），并贴出发布链路和 diff 分段核心代码。测试重点为唯一发布路径、AI 故障自动降级不阻断、点赞幂等。</w:t>
+      </w:r>
+    </w:p>
+    <w:p>
+      <w:pPr>
+        <w:spacing w:before="0" w:after="0" w:line="360" w:lineRule="auto"/>
+        <w:jc w:val="left"/>
+      </w:pPr>
+      <w:r>
+        <w:rPr>
+          <w:rFonts w:ascii="Times New Roman" w:hAnsi="Times New Roman" w:eastAsia="宋体"/>
+          <w:b w:val="0"/>
+          <w:sz w:val="24"/>
+        </w:rPr>
+        <w:t>丁水悦负责资料库与教务学分自查。模块范围包括 /materials 与 /credits：/materials 负责资料树、拖拽上传、在线预览和致谢公告；/credits 负责成绩单导入和学分自查。需求阶段以注册用户为主、管理员负责致谢公告，编写 8 个用例，绘制模块用例图和功能级 DFD，DFD 中必须标明“成绩单 PDF 中转、前端 pdf.js 本地解析、PDF 不落服务器”。核心用例为“拖拽上传”“教务一键导入自查”“文件树重排”。概要设计阶段说明 materials、uploads、transcript 的映射关系，物理结构包括 MaterialResource、MaterialFile（自引用树）、MaterialNotice（单例），外部接口写 jwxt 中转端点和浏览器端 pdf.js。详细设计阶段绘制 1 张类图，4 张顺序图（拖拽上传真实字节进度、文件树重排乐观更新与环路守卫、成绩单书签中转回传与轮询取件、成绩单本地解析生成报告），2 张状态图（上传任务状态、ImportPhase），3 张活动图（save_upload 校验流水线、projectDrop 环路守卫、parseTranscript 解析）。测试重点为 50MB 截断、魔数校验、同名自动重命名、PDF 全程不落盘、仅 owner 可删除。</w:t>
+      </w:r>
+    </w:p>
+    <w:p>
+      <w:pPr>
+        <w:spacing w:before="0" w:after="0" w:line="360" w:lineRule="auto"/>
+        <w:jc w:val="left"/>
+      </w:pPr>
+      <w:r>
+        <w:rPr>
+          <w:rFonts w:ascii="Times New Roman" w:hAnsi="Times New Roman" w:eastAsia="宋体"/>
+          <w:b w:val="0"/>
+          <w:sz w:val="24"/>
+        </w:rPr>
+        <w:t>王艺婷负责导师/院校库与 CCF 会议截稿。模块范围包括 /schools 和 /conferences：/schools 负责导师检索、分组和详情抽屉；/conferences 负责会议清单和时间轴。需求阶段设置匿名访客、外部系统和管理员三类参与者，编写 7 个用例，绘制模块用例图（必须画出“外部系统”参与者）和功能级 DFD（爬取、抽取、入库、只读查询），核心用例为“拼音模糊搜索”和“会议自动更新”。概要设计阶段说明 schools.sqlite 与 conferences.sqlite 为独立只读库，不走 ORM；绘制外部数据模型 E-R，覆盖 school、department、advisor、quota、evaluation、trace、conference 等表，注明 supervisor-claw 与 seed 管线产出、本模块只读挂载；外部接口写 ccfddl、DuckDuckGo 和 DeepSeek。详细设计阶段绘制数据模型/类图，3 张顺序图（导师融合搜索、会议自动更新三级降级、导师详情多表联合加载），1 张会议 crawl_state 状态图，2 张活动图（导师融合匹配、会议三级降级抓取）。测试重点为拼音、首字母、CJK 子串三种写法均命中，closed 终态不再抓取，爬取失败时能够降级兜底。</w:t>
+      </w:r>
+    </w:p>
+    <w:p>
+      <w:pPr>
+        <w:spacing w:before="0" w:after="0" w:line="360" w:lineRule="auto"/>
+        <w:jc w:val="left"/>
+      </w:pPr>
+      <w:r>
+        <w:rPr>
+          <w:rFonts w:ascii="Times New Roman" w:hAnsi="Times New Roman" w:eastAsia="宋体"/>
+          <w:b w:val="0"/>
+          <w:sz w:val="24"/>
+        </w:rPr>
+        <w:t>石建华负责管理后台、鉴权、班级空间与小组协作。模块范围包括 /admin、/auth 和 /class：/admin 负责用户、班级、登录审计和角色；/auth 负责登录与资料；/class 负责点名、小组和甘特任务。需求阶段设置注册用户、管理员、超级管理员三级参与者，编写 7 个用例，绘制全系统唯一一张三级 actor 均出现的模块用例图，并绘制登录审计、审批入组相关 DFD；核心用例为“超管硬删级联”“入组审批”“班委点名”。概要设计阶段负责最重的 ORM 物理结构，覆盖 User、StudentClass、LoginEvent、RollCall 两表、Group、GroupMember、GroupJoinRequest、GroupFile、GroupTask、GroupTaskAssignee 共 11 张表，并先形成本模块局部 E-R，供主编拼接全局 E-R。详细设计阶段绘制 1 张类图，4 张顺序图（登录与写审计、超管硬删账户多阶段级联清理、入组审批与同班其他待批联动拒绝、创建甘特任务校验负责人），3 张状态图（User.role、GroupJoinRequest.status、GroupTask.status），3 张活动图（三级角色与班委/组长复合权限判定、点名快照与迟到增量补签、硬删顺序敏感级联）。测试重点为不可自改、不可动超管、一人一活跃小组、审批并发再校验、硬删顺序颠倒会产生孤儿文件。</w:t>
+      </w:r>
+    </w:p>
+    <w:p>
+      <w:pPr>
+        <w:pStyle w:val="Heading3"/>
+        <w:spacing w:before="120" w:after="60" w:line="276" w:lineRule="auto"/>
+        <w:jc w:val="left"/>
+      </w:pPr>
+      <w:r>
+        <w:rPr>
+          <w:rFonts w:ascii="Times New Roman" w:hAnsi="Times New Roman" w:eastAsia="宋体"/>
+          <w:b w:val="0"/>
+          <w:sz w:val="28"/>
+        </w:rPr>
+        <w:t>3.2 接口人员</w:t>
+      </w:r>
+    </w:p>
+    <w:p>
+      <w:pPr>
+        <w:spacing w:before="0" w:after="0" w:line="360" w:lineRule="auto"/>
+        <w:jc w:val="left"/>
+      </w:pPr>
+      <w:r>
+        <w:rPr>
+          <w:rFonts w:ascii="Times New Roman" w:hAnsi="Times New Roman" w:eastAsia="宋体"/>
+          <w:b w:val="0"/>
+          <w:sz w:val="24"/>
+        </w:rPr>
+        <w:t>组长赵文彪作为接口协调人，负责统一路由命名、数据库命名、图表编号、术语和测试口径。各模块负责人分别对本模块与其他模块的接口负责：陶语涵负责笔记与 AI 接口边界；丁水悦负责资料上传、成绩单中转和 owner 权限边界；王艺婷负责只读库、爬虫与外部数据源边界；石建华负责鉴权、角色、班级和小组权限边界。</w:t>
+      </w:r>
+    </w:p>
+    <w:p>
+      <w:pPr>
+        <w:pStyle w:val="Heading3"/>
+        <w:spacing w:before="120" w:after="60" w:line="276" w:lineRule="auto"/>
+        <w:jc w:val="left"/>
+      </w:pPr>
+      <w:r>
+        <w:rPr>
+          <w:rFonts w:ascii="Times New Roman" w:hAnsi="Times New Roman" w:eastAsia="宋体"/>
+          <w:b w:val="0"/>
+          <w:sz w:val="28"/>
+        </w:rPr>
+        <w:t>3.3 进度</w:t>
+      </w:r>
+    </w:p>
+    <w:p>
+      <w:pPr>
+        <w:pStyle w:val="表题"/>
+        <w:spacing w:before="120" w:after="60" w:line="276" w:lineRule="auto"/>
+        <w:jc w:val="center"/>
+      </w:pPr>
+      <w:r>
+        <w:rPr>
+          <w:rFonts w:ascii="Times New Roman" w:hAnsi="Times New Roman" w:eastAsia="宋体"/>
+          <w:b/>
+          <w:sz w:val="21"/>
+        </w:rPr>
+        <w:t>表3-2　项目进度计划</w:t>
+      </w:r>
+    </w:p>
+    <w:tbl>
+      <w:tblPr>
+        <w:tblW w:type="dxa" w:w="8312"/>
+        <w:tblLayout w:type="fixed"/>
+        <w:tblLook w:firstColumn="1" w:firstRow="1" w:lastColumn="0" w:lastRow="0" w:noHBand="0" w:noVBand="1" w:val="04A0"/>
+        <w:tblBorders>
+          <w:top w:val="single" w:sz="12" w:color="000000"/>
+          <w:bottom w:val="single" w:sz="12" w:color="000000"/>
+          <w:left w:val="nil"/>
+          <w:right w:val="nil"/>
+          <w:insideH w:val="nil"/>
+          <w:insideV w:val="nil"/>
+        </w:tblBorders>
+      </w:tblPr>
+      <w:tblGrid>
+        <w:gridCol w:w="1164"/>
+        <w:gridCol w:w="4821"/>
+        <w:gridCol w:w="2327"/>
+      </w:tblGrid>
+      <w:tr>
+        <w:trPr>
+          <w:trHeight w:val="430" w:hRule="atLeast"/>
+        </w:trPr>
+        <w:tc>
+          <w:tcPr>
+            <w:tcW w:type="dxa" w:w="1164"/>
+            <w:tcMar>
+              <w:top w:w="65" w:type="dxa"/>
+              <w:start w:w="80" w:type="dxa"/>
+              <w:bottom w:w="65" w:type="dxa"/>
+              <w:end w:w="80" w:type="dxa"/>
+            </w:tcMar>
+            <w:vAlign w:val="center"/>
+            <w:shd w:fill="EDEDED" w:val="clear"/>
+            <w:tcBorders>
+              <w:bottom w:val="single" w:sz="8" w:color="000000" w:space="0"/>
+            </w:tcBorders>
+          </w:tcPr>
+          <w:p>
+            <w:pPr>
+              <w:spacing w:before="0" w:after="0" w:line="276" w:lineRule="auto"/>
+              <w:jc w:val="center"/>
+            </w:pPr>
+            <w:r>
+              <w:rPr>
+                <w:rFonts w:ascii="Times New Roman" w:hAnsi="Times New Roman" w:eastAsia="宋体"/>
+                <w:b/>
+                <w:sz w:val="21"/>
+              </w:rPr>
+              <w:t>日期</w:t>
+            </w:r>
+          </w:p>
+        </w:tc>
+        <w:tc>
+          <w:tcPr>
+            <w:tcW w:type="dxa" w:w="4821"/>
+            <w:tcMar>
+              <w:top w:w="65" w:type="dxa"/>
+              <w:start w:w="80" w:type="dxa"/>
+              <w:bottom w:w="65" w:type="dxa"/>
+              <w:end w:w="80" w:type="dxa"/>
+            </w:tcMar>
+            <w:vAlign w:val="center"/>
+            <w:shd w:fill="EDEDED" w:val="clear"/>
+            <w:tcBorders>
+              <w:bottom w:val="single" w:sz="8" w:color="000000" w:space="0"/>
+            </w:tcBorders>
+          </w:tcPr>
+          <w:p>
+            <w:pPr>
+              <w:spacing w:before="0" w:after="0" w:line="276" w:lineRule="auto"/>
+              <w:jc w:val="center"/>
+            </w:pPr>
+            <w:r>
+              <w:rPr>
+                <w:rFonts w:ascii="Times New Roman" w:hAnsi="Times New Roman" w:eastAsia="宋体"/>
+                <w:b/>
+                <w:sz w:val="21"/>
+              </w:rPr>
+              <w:t>主要任务</w:t>
+            </w:r>
+          </w:p>
+        </w:tc>
+        <w:tc>
+          <w:tcPr>
+            <w:tcW w:type="dxa" w:w="2327"/>
+            <w:tcMar>
+              <w:top w:w="65" w:type="dxa"/>
+              <w:start w:w="80" w:type="dxa"/>
+              <w:bottom w:w="65" w:type="dxa"/>
+              <w:end w:w="80" w:type="dxa"/>
+            </w:tcMar>
+            <w:vAlign w:val="center"/>
+            <w:shd w:fill="EDEDED" w:val="clear"/>
+            <w:tcBorders>
+              <w:bottom w:val="single" w:sz="8" w:color="000000" w:space="0"/>
+            </w:tcBorders>
+          </w:tcPr>
+          <w:p>
+            <w:pPr>
+              <w:spacing w:before="0" w:after="0" w:line="276" w:lineRule="auto"/>
+              <w:jc w:val="center"/>
+            </w:pPr>
+            <w:r>
+              <w:rPr>
+                <w:rFonts w:ascii="Times New Roman" w:hAnsi="Times New Roman" w:eastAsia="宋体"/>
+                <w:b/>
+                <w:sz w:val="21"/>
+              </w:rPr>
+              <w:t>阶段输出</w:t>
+            </w:r>
+          </w:p>
+        </w:tc>
+      </w:tr>
+      <w:tr>
+        <w:trPr>
+          <w:trHeight w:val="430" w:hRule="atLeast"/>
+        </w:trPr>
+        <w:tc>
+          <w:tcPr>
+            <w:tcW w:type="dxa" w:w="1164"/>
+            <w:tcMar>
+              <w:top w:w="65" w:type="dxa"/>
+              <w:start w:w="80" w:type="dxa"/>
+              <w:bottom w:w="65" w:type="dxa"/>
+              <w:end w:w="80" w:type="dxa"/>
+            </w:tcMar>
+            <w:vAlign w:val="center"/>
+          </w:tcPr>
+          <w:p>
+            <w:pPr>
+              <w:spacing w:before="0" w:after="0" w:line="276" w:lineRule="auto"/>
+              <w:jc w:val="center"/>
+            </w:pPr>
+            <w:r>
+              <w:rPr>
+                <w:rFonts w:ascii="Times New Roman" w:hAnsi="Times New Roman" w:eastAsia="宋体"/>
+                <w:sz w:val="21"/>
+              </w:rPr>
+              <w:t>7 月 4 日</w:t>
+            </w:r>
+          </w:p>
+        </w:tc>
+        <w:tc>
+          <w:tcPr>
+            <w:tcW w:type="dxa" w:w="4821"/>
+            <w:tcMar>
+              <w:top w:w="65" w:type="dxa"/>
+              <w:start w:w="80" w:type="dxa"/>
+              <w:bottom w:w="65" w:type="dxa"/>
+              <w:end w:w="80" w:type="dxa"/>
+            </w:tcMar>
+            <w:vAlign w:val="center"/>
+          </w:tcPr>
+          <w:p>
+            <w:pPr>
+              <w:spacing w:before="0" w:after="0" w:line="276" w:lineRule="auto"/>
+              <w:jc w:val="left"/>
+            </w:pPr>
+            <w:r>
+              <w:rPr>
+                <w:rFonts w:ascii="Times New Roman" w:hAnsi="Times New Roman" w:eastAsia="宋体"/>
+                <w:sz w:val="21"/>
+              </w:rPr>
+              <w:t>熟悉 CodeArts、Claude Code、Tailscale、tmux、ssh；在 WSL 模拟服务器端测试部署</w:t>
+            </w:r>
+          </w:p>
+        </w:tc>
+        <w:tc>
+          <w:tcPr>
+            <w:tcW w:type="dxa" w:w="2327"/>
+            <w:tcMar>
+              <w:top w:w="65" w:type="dxa"/>
+              <w:start w:w="80" w:type="dxa"/>
+              <w:bottom w:w="65" w:type="dxa"/>
+              <w:end w:w="80" w:type="dxa"/>
+            </w:tcMar>
+            <w:vAlign w:val="center"/>
+          </w:tcPr>
+          <w:p>
+            <w:pPr>
+              <w:spacing w:before="0" w:after="0" w:line="276" w:lineRule="auto"/>
+              <w:jc w:val="left"/>
+            </w:pPr>
+            <w:r>
+              <w:rPr>
+                <w:rFonts w:ascii="Times New Roman" w:hAnsi="Times New Roman" w:eastAsia="宋体"/>
+                <w:sz w:val="21"/>
+              </w:rPr>
+              <w:t>开发环境、远程工作流、部署验证记录</w:t>
+            </w:r>
+          </w:p>
+        </w:tc>
+      </w:tr>
+      <w:tr>
+        <w:trPr>
+          <w:trHeight w:val="430" w:hRule="atLeast"/>
+        </w:trPr>
+        <w:tc>
+          <w:tcPr>
+            <w:tcW w:type="dxa" w:w="1164"/>
+            <w:tcMar>
+              <w:top w:w="65" w:type="dxa"/>
+              <w:start w:w="80" w:type="dxa"/>
+              <w:bottom w:w="65" w:type="dxa"/>
+              <w:end w:w="80" w:type="dxa"/>
+            </w:tcMar>
+            <w:vAlign w:val="center"/>
+          </w:tcPr>
+          <w:p>
+            <w:pPr>
+              <w:spacing w:before="0" w:after="0" w:line="276" w:lineRule="auto"/>
+              <w:jc w:val="center"/>
+            </w:pPr>
+            <w:r>
+              <w:rPr>
+                <w:rFonts w:ascii="Times New Roman" w:hAnsi="Times New Roman" w:eastAsia="宋体"/>
+                <w:sz w:val="21"/>
+              </w:rPr>
+              <w:t>7 月 5 日</w:t>
+            </w:r>
+          </w:p>
+        </w:tc>
+        <w:tc>
+          <w:tcPr>
+            <w:tcW w:type="dxa" w:w="4821"/>
+            <w:tcMar>
+              <w:top w:w="65" w:type="dxa"/>
+              <w:start w:w="80" w:type="dxa"/>
+              <w:bottom w:w="65" w:type="dxa"/>
+              <w:end w:w="80" w:type="dxa"/>
+            </w:tcMar>
+            <w:vAlign w:val="center"/>
+          </w:tcPr>
+          <w:p>
+            <w:pPr>
+              <w:spacing w:before="0" w:after="0" w:line="276" w:lineRule="auto"/>
+              <w:jc w:val="left"/>
+            </w:pPr>
+            <w:r>
+              <w:rPr>
+                <w:rFonts w:ascii="Times New Roman" w:hAnsi="Times New Roman" w:eastAsia="宋体"/>
+                <w:sz w:val="21"/>
+              </w:rPr>
+              <w:t>按四个模块完成需求分析和概要设计初稿，列出用例、DFD、E-R 和接口边界</w:t>
+            </w:r>
+          </w:p>
+        </w:tc>
+        <w:tc>
+          <w:tcPr>
+            <w:tcW w:type="dxa" w:w="2327"/>
+            <w:tcMar>
+              <w:top w:w="65" w:type="dxa"/>
+              <w:start w:w="80" w:type="dxa"/>
+              <w:bottom w:w="65" w:type="dxa"/>
+              <w:end w:w="80" w:type="dxa"/>
+            </w:tcMar>
+            <w:vAlign w:val="center"/>
+          </w:tcPr>
+          <w:p>
+            <w:pPr>
+              <w:spacing w:before="0" w:after="0" w:line="276" w:lineRule="auto"/>
+              <w:jc w:val="left"/>
+            </w:pPr>
+            <w:r>
+              <w:rPr>
+                <w:rFonts w:ascii="Times New Roman" w:hAnsi="Times New Roman" w:eastAsia="宋体"/>
+                <w:sz w:val="21"/>
+              </w:rPr>
+              <w:t>第 4 章、第 5 章素材初稿</w:t>
+            </w:r>
+          </w:p>
+        </w:tc>
+      </w:tr>
+      <w:tr>
+        <w:trPr>
+          <w:trHeight w:val="430" w:hRule="atLeast"/>
+        </w:trPr>
+        <w:tc>
+          <w:tcPr>
+            <w:tcW w:type="dxa" w:w="1164"/>
+            <w:tcMar>
+              <w:top w:w="65" w:type="dxa"/>
+              <w:start w:w="80" w:type="dxa"/>
+              <w:bottom w:w="65" w:type="dxa"/>
+              <w:end w:w="80" w:type="dxa"/>
+            </w:tcMar>
+            <w:vAlign w:val="center"/>
+          </w:tcPr>
+          <w:p>
+            <w:pPr>
+              <w:spacing w:before="0" w:after="0" w:line="276" w:lineRule="auto"/>
+              <w:jc w:val="center"/>
+            </w:pPr>
+            <w:r>
+              <w:rPr>
+                <w:rFonts w:ascii="Times New Roman" w:hAnsi="Times New Roman" w:eastAsia="宋体"/>
+                <w:sz w:val="21"/>
+              </w:rPr>
+              <w:t>7 月 6 日</w:t>
+            </w:r>
+          </w:p>
+        </w:tc>
+        <w:tc>
+          <w:tcPr>
+            <w:tcW w:type="dxa" w:w="4821"/>
+            <w:tcMar>
+              <w:top w:w="65" w:type="dxa"/>
+              <w:start w:w="80" w:type="dxa"/>
+              <w:bottom w:w="65" w:type="dxa"/>
+              <w:end w:w="80" w:type="dxa"/>
+            </w:tcMar>
+            <w:vAlign w:val="center"/>
+          </w:tcPr>
+          <w:p>
+            <w:pPr>
+              <w:spacing w:before="0" w:after="0" w:line="276" w:lineRule="auto"/>
+              <w:jc w:val="left"/>
+            </w:pPr>
+            <w:r>
+              <w:rPr>
+                <w:rFonts w:ascii="Times New Roman" w:hAnsi="Times New Roman" w:eastAsia="宋体"/>
+                <w:sz w:val="21"/>
+              </w:rPr>
+              <w:t>完成详细设计、编码实现、模块测试和核心代码整理</w:t>
+            </w:r>
+          </w:p>
+        </w:tc>
+        <w:tc>
+          <w:tcPr>
+            <w:tcW w:type="dxa" w:w="2327"/>
+            <w:tcMar>
+              <w:top w:w="65" w:type="dxa"/>
+              <w:start w:w="80" w:type="dxa"/>
+              <w:bottom w:w="65" w:type="dxa"/>
+              <w:end w:w="80" w:type="dxa"/>
+            </w:tcMar>
+            <w:vAlign w:val="center"/>
+          </w:tcPr>
+          <w:p>
+            <w:pPr>
+              <w:spacing w:before="0" w:after="0" w:line="276" w:lineRule="auto"/>
+              <w:jc w:val="left"/>
+            </w:pPr>
+            <w:r>
+              <w:rPr>
+                <w:rFonts w:ascii="Times New Roman" w:hAnsi="Times New Roman" w:eastAsia="宋体"/>
+                <w:sz w:val="21"/>
+              </w:rPr>
+              <w:t>第 6 章、第 7 章素材；可演示系统</w:t>
+            </w:r>
+          </w:p>
+        </w:tc>
+      </w:tr>
+      <w:tr>
+        <w:trPr>
+          <w:trHeight w:val="430" w:hRule="atLeast"/>
+        </w:trPr>
+        <w:tc>
+          <w:tcPr>
+            <w:tcW w:type="dxa" w:w="1164"/>
+            <w:tcMar>
+              <w:top w:w="65" w:type="dxa"/>
+              <w:start w:w="80" w:type="dxa"/>
+              <w:bottom w:w="65" w:type="dxa"/>
+              <w:end w:w="80" w:type="dxa"/>
+            </w:tcMar>
+            <w:vAlign w:val="center"/>
+          </w:tcPr>
+          <w:p>
+            <w:pPr>
+              <w:spacing w:before="0" w:after="0" w:line="276" w:lineRule="auto"/>
+              <w:jc w:val="center"/>
+            </w:pPr>
+            <w:r>
+              <w:rPr>
+                <w:rFonts w:ascii="Times New Roman" w:hAnsi="Times New Roman" w:eastAsia="宋体"/>
+                <w:sz w:val="21"/>
+              </w:rPr>
+              <w:t>7 月 7-9 日</w:t>
+            </w:r>
+          </w:p>
+        </w:tc>
+        <w:tc>
+          <w:tcPr>
+            <w:tcW w:type="dxa" w:w="4821"/>
+            <w:tcMar>
+              <w:top w:w="65" w:type="dxa"/>
+              <w:start w:w="80" w:type="dxa"/>
+              <w:bottom w:w="65" w:type="dxa"/>
+              <w:end w:w="80" w:type="dxa"/>
+            </w:tcMar>
+            <w:vAlign w:val="center"/>
+          </w:tcPr>
+          <w:p>
+            <w:pPr>
+              <w:spacing w:before="0" w:after="0" w:line="276" w:lineRule="auto"/>
+              <w:jc w:val="left"/>
+            </w:pPr>
+            <w:r>
+              <w:rPr>
+                <w:rFonts w:ascii="Times New Roman" w:hAnsi="Times New Roman" w:eastAsia="宋体"/>
+                <w:sz w:val="21"/>
+              </w:rPr>
+              <w:t>文档汇总、图表复核、目录更新、排版检查和提交材料整理</w:t>
+            </w:r>
+          </w:p>
+        </w:tc>
+        <w:tc>
+          <w:tcPr>
+            <w:tcW w:type="dxa" w:w="2327"/>
+            <w:tcMar>
+              <w:top w:w="65" w:type="dxa"/>
+              <w:start w:w="80" w:type="dxa"/>
+              <w:bottom w:w="65" w:type="dxa"/>
+              <w:end w:w="80" w:type="dxa"/>
+            </w:tcMar>
+            <w:vAlign w:val="center"/>
+          </w:tcPr>
+          <w:p>
+            <w:pPr>
+              <w:spacing w:before="0" w:after="0" w:line="276" w:lineRule="auto"/>
+              <w:jc w:val="left"/>
+            </w:pPr>
+            <w:r>
+              <w:rPr>
+                <w:rFonts w:ascii="Times New Roman" w:hAnsi="Times New Roman" w:eastAsia="宋体"/>
+                <w:sz w:val="21"/>
+              </w:rPr>
+              <w:t>课程论文定稿与演示材料</w:t>
+            </w:r>
+          </w:p>
+        </w:tc>
+      </w:tr>
+    </w:tbl>
+    <w:p>
+      <w:pPr>
+        <w:pStyle w:val="Heading3"/>
+        <w:spacing w:before="120" w:after="60" w:line="276" w:lineRule="auto"/>
+        <w:jc w:val="left"/>
+      </w:pPr>
+      <w:r>
+        <w:rPr>
+          <w:rFonts w:ascii="Times New Roman" w:hAnsi="Times New Roman" w:eastAsia="宋体"/>
+          <w:b w:val="0"/>
+          <w:sz w:val="28"/>
+        </w:rPr>
+        <w:t>3.4 预算</w:t>
+      </w:r>
+    </w:p>
+    <w:p>
+      <w:pPr>
+        <w:spacing w:before="0" w:after="0" w:line="360" w:lineRule="auto"/>
+        <w:jc w:val="left"/>
+      </w:pPr>
+      <w:r>
+        <w:rPr>
+          <w:rFonts w:ascii="Times New Roman" w:hAnsi="Times New Roman" w:eastAsia="宋体"/>
+          <w:b w:val="0"/>
+          <w:sz w:val="24"/>
+        </w:rPr>
+        <w:t>预算沿用第二章 6.1 的支出口径。现金支出主要包括华为云轻量 VPS 和 DeepSeek API 按量调用；feiyue.selab.top 为 selab.top 子域，不单独产生注册年费；FastAPI、React、nginx、SQLite、Let's Encrypt、age 和 Hugging Face 免费额度不产生软件授权费用；开发人力为项目小组自筹投入，按折算工时统计，不作为实际现金支出。</w:t>
+      </w:r>
+    </w:p>
+    <w:p>
+      <w:pPr>
+        <w:pStyle w:val="Heading3"/>
+        <w:spacing w:before="120" w:after="60" w:line="276" w:lineRule="auto"/>
+        <w:jc w:val="left"/>
+      </w:pPr>
+      <w:r>
+        <w:rPr>
+          <w:rFonts w:ascii="Times New Roman" w:hAnsi="Times New Roman" w:eastAsia="宋体"/>
+          <w:b w:val="0"/>
+          <w:sz w:val="28"/>
+        </w:rPr>
+        <w:t>3.5 关键问题</w:t>
+      </w:r>
+    </w:p>
+    <w:p>
+      <w:pPr>
+        <w:spacing w:before="0" w:after="0" w:line="360" w:lineRule="auto"/>
+        <w:jc w:val="left"/>
+      </w:pPr>
+      <w:r>
+        <w:rPr>
+          <w:rFonts w:ascii="Times New Roman" w:hAnsi="Times New Roman" w:eastAsia="宋体"/>
+          <w:b w:val="0"/>
+          <w:sz w:val="24"/>
+        </w:rPr>
+        <w:t>关键问题包括：第一，项目周期短，需依靠模块化分工和每日合并复核控制进度；第二，第 5 章概要设计中的功能-程序映射、物理结构和 E-R 图需要统一复核，避免 AI 工具建议与软工课程要求不一致；第三，资料库和教务学分自查必须保证 PDF 不落服务器；第四，AI 相关接口必须设计降级和限流，避免上游故障或费用失控；第五，管理后台和班级空间权限复杂，必须通过测试覆盖角色边界、审批并发和硬删级联顺序。</w:t>
+      </w:r>
+    </w:p>
+    <w:p>
+      <w:pPr>
+        <w:pStyle w:val="Heading2"/>
+        <w:spacing w:before="240" w:after="120" w:line="276" w:lineRule="auto"/>
+        <w:jc w:val="left"/>
+      </w:pPr>
+      <w:r>
+        <w:rPr>
+          <w:rFonts w:ascii="Times New Roman" w:hAnsi="Times New Roman" w:eastAsia="宋体"/>
+          <w:b w:val="0"/>
+          <w:sz w:val="30"/>
+        </w:rPr>
+        <w:t>4 支持条件</w:t>
+      </w:r>
+    </w:p>
+    <w:p>
+      <w:pPr>
+        <w:pStyle w:val="Heading3"/>
+        <w:spacing w:before="120" w:after="60" w:line="276" w:lineRule="auto"/>
+        <w:jc w:val="left"/>
+      </w:pPr>
+      <w:r>
+        <w:rPr>
+          <w:rFonts w:ascii="Times New Roman" w:hAnsi="Times New Roman" w:eastAsia="宋体"/>
+          <w:b w:val="0"/>
+          <w:sz w:val="28"/>
+        </w:rPr>
+        <w:t>4.1 计算机系统支持</w:t>
+      </w:r>
+    </w:p>
+    <w:p>
+      <w:pPr>
+        <w:spacing w:before="0" w:after="0" w:line="360" w:lineRule="auto"/>
+        <w:jc w:val="left"/>
+      </w:pPr>
+      <w:r>
+        <w:rPr>
+          <w:rFonts w:ascii="Times New Roman" w:hAnsi="Times New Roman" w:eastAsia="宋体"/>
+          <w:b w:val="0"/>
+          <w:sz w:val="24"/>
+        </w:rPr>
+        <w:t>开发与测试需要一台本地开发机、一套 WSL 本地模拟环境、一台云服务器或等价测试环境，以及 Git、Python、Node.js、pnpm、uv、FastAPI、React、SQLite、nginx 等基础软件。远程协作和自动化开发使用 CodeArts、Claude Code、Tailscale、tmux 与 ssh；部署验证使用本地 WSL 和服务器端服务进程。</w:t>
+      </w:r>
+    </w:p>
+    <w:p>
+      <w:pPr>
+        <w:pStyle w:val="Heading3"/>
+        <w:spacing w:before="120" w:after="60" w:line="276" w:lineRule="auto"/>
+        <w:jc w:val="left"/>
+      </w:pPr>
+      <w:r>
+        <w:rPr>
+          <w:rFonts w:ascii="Times New Roman" w:hAnsi="Times New Roman" w:eastAsia="宋体"/>
+          <w:b w:val="0"/>
+          <w:sz w:val="28"/>
+        </w:rPr>
+        <w:t>4.2 需由用户承担的工作</w:t>
+      </w:r>
+    </w:p>
+    <w:p>
+      <w:pPr>
+        <w:spacing w:before="0" w:after="0" w:line="360" w:lineRule="auto"/>
+        <w:jc w:val="left"/>
+      </w:pPr>
+      <w:r>
+        <w:rPr>
+          <w:rFonts w:ascii="Times New Roman" w:hAnsi="Times New Roman" w:eastAsia="宋体"/>
+          <w:b w:val="0"/>
+          <w:sz w:val="24"/>
+        </w:rPr>
+        <w:t>项目组成员需按分工提供模块需求、图表、测试记录和核心代码说明；组长负责集成、复核、排版和提交。试用用户需提供真实使用反馈，必要时提供可脱敏的资料上传、浏览、学分自查和班级协作操作记录，用于修正需求与测试用例。</w:t>
+      </w:r>
+    </w:p>
+    <w:p>
+      <w:pPr>
+        <w:pStyle w:val="Heading3"/>
+        <w:spacing w:before="120" w:after="60" w:line="276" w:lineRule="auto"/>
+        <w:jc w:val="left"/>
+      </w:pPr>
+      <w:r>
+        <w:rPr>
+          <w:rFonts w:ascii="Times New Roman" w:hAnsi="Times New Roman" w:eastAsia="宋体"/>
+          <w:b w:val="0"/>
+          <w:sz w:val="28"/>
+        </w:rPr>
+        <w:t>4.3 由外单位提供的条件</w:t>
+      </w:r>
+    </w:p>
+    <w:p>
+      <w:pPr>
+        <w:spacing w:before="0" w:after="0" w:line="360" w:lineRule="auto"/>
+        <w:jc w:val="left"/>
+      </w:pPr>
+      <w:r>
+        <w:rPr>
+          <w:rFonts w:ascii="Times New Roman" w:hAnsi="Times New Roman" w:eastAsia="宋体"/>
+          <w:b w:val="0"/>
+          <w:sz w:val="24"/>
+        </w:rPr>
+        <w:t>外部条件包括学校教务系统提供学生本人可访问的成绩单页面，DeepSeek 提供 AI 接口，ccfddl、DuckDuckGo、supervisor-claw、xju-course-wiki 和 Notion 等数据源提供可导入或可查询的外部数据，云服务商提供 VPS、域名解析、HTTPS 证书申请和网络环境。所有外部访问均应遵守相应平台规则和学校管理要求。</w:t>
+      </w:r>
+    </w:p>
+    <w:p>
+      <w:pPr>
+        <w:pStyle w:val="Heading2"/>
+        <w:spacing w:before="240" w:after="120" w:line="276" w:lineRule="auto"/>
+        <w:jc w:val="left"/>
+      </w:pPr>
+      <w:r>
+        <w:rPr>
+          <w:rFonts w:ascii="Times New Roman" w:hAnsi="Times New Roman" w:eastAsia="宋体"/>
+          <w:b w:val="0"/>
+          <w:sz w:val="30"/>
+        </w:rPr>
         <w:t>5 专题计划要点</w:t>
+      </w:r>
+    </w:p>
+    <w:p>
+      <w:pPr>
+        <w:spacing w:before="0" w:after="0" w:line="360" w:lineRule="auto"/>
+        <w:jc w:val="left"/>
+      </w:pPr>
+      <w:r>
+        <w:rPr>
+          <w:rFonts w:ascii="Times New Roman" w:hAnsi="Times New Roman" w:eastAsia="宋体"/>
+          <w:b w:val="0"/>
+          <w:sz w:val="24"/>
+        </w:rPr>
+        <w:t>专题计划包括四项。第一，概要设计复核计划：各模块先按业务域形成概要设计初稿，组长统一复核程序映射、数据库表、E-R 图和接口边界。第二，图表计划：每个模块至少完成用例图或 DFD，并在详细设计中补齐类图、顺序图、状态图和活动图。第三，测试计划：围绕唯一发布路径、上传安全、PDF 不落盘、外部数据降级、权限边界和硬删级联等风险点设计测试用例。第四，隐私与安全计划：成绩单中转只短时暂存，上传文件执行白名单和魔数校验，AI 接口设计鉴权、限流、缓存和降级。</w:t>
       </w:r>
     </w:p>
     <w:p>

</xml_diff>

<commit_message>
docs: simplify development plan table
</commit_message>
<xml_diff>
--- a/docs/course-design/赵文彪-飞跃.docx
+++ b/docs/course-design/赵文彪-飞跃.docx
@@ -10805,6 +10805,7 @@
     <w:p>
       <w:pPr>
         <w:spacing w:before="0" w:after="0" w:line="360" w:lineRule="auto"/>
+        <w:ind w:firstLine="480"/>
         <w:jc w:val="left"/>
       </w:pPr>
       <w:r>
@@ -10819,6 +10820,7 @@
     <w:p>
       <w:pPr>
         <w:spacing w:before="0" w:after="0" w:line="360" w:lineRule="auto"/>
+        <w:ind w:firstLine="480"/>
         <w:jc w:val="left"/>
       </w:pPr>
       <w:r>
@@ -10863,6 +10865,7 @@
     <w:p>
       <w:pPr>
         <w:spacing w:before="0" w:after="0" w:line="360" w:lineRule="auto"/>
+        <w:ind w:firstLine="480"/>
         <w:jc w:val="left"/>
       </w:pPr>
       <w:r>
@@ -10877,6 +10880,7 @@
     <w:p>
       <w:pPr>
         <w:spacing w:before="0" w:after="0" w:line="360" w:lineRule="auto"/>
+        <w:ind w:firstLine="480"/>
         <w:jc w:val="left"/>
       </w:pPr>
       <w:r>
@@ -10906,6 +10910,7 @@
     <w:p>
       <w:pPr>
         <w:spacing w:before="0" w:after="0" w:line="360" w:lineRule="auto"/>
+        <w:ind w:firstLine="480"/>
         <w:jc w:val="left"/>
       </w:pPr>
       <w:r>
@@ -10935,6 +10940,7 @@
     <w:p>
       <w:pPr>
         <w:spacing w:before="0" w:after="0" w:line="360" w:lineRule="auto"/>
+        <w:ind w:firstLine="480"/>
         <w:jc w:val="left"/>
       </w:pPr>
       <w:r>
@@ -10949,6 +10955,7 @@
     <w:p>
       <w:pPr>
         <w:spacing w:before="0" w:after="0" w:line="360" w:lineRule="auto"/>
+        <w:ind w:firstLine="480"/>
         <w:jc w:val="left"/>
       </w:pPr>
       <w:r>
@@ -10978,6 +10985,7 @@
     <w:p>
       <w:pPr>
         <w:spacing w:before="0" w:after="0" w:line="360" w:lineRule="auto"/>
+        <w:ind w:firstLine="480"/>
         <w:jc w:val="left"/>
       </w:pPr>
       <w:r>
@@ -11007,6 +11015,7 @@
     <w:p>
       <w:pPr>
         <w:spacing w:before="0" w:after="0" w:line="360" w:lineRule="auto"/>
+        <w:ind w:firstLine="480"/>
         <w:jc w:val="left"/>
       </w:pPr>
       <w:r>
@@ -11036,6 +11045,7 @@
     <w:p>
       <w:pPr>
         <w:spacing w:before="0" w:after="0" w:line="360" w:lineRule="auto"/>
+        <w:ind w:firstLine="480"/>
         <w:jc w:val="left"/>
       </w:pPr>
       <w:r>
@@ -11080,6 +11090,7 @@
     <w:p>
       <w:pPr>
         <w:spacing w:before="0" w:after="0" w:line="360" w:lineRule="auto"/>
+        <w:ind w:firstLine="480"/>
         <w:jc w:val="left"/>
       </w:pPr>
       <w:r>
@@ -11121,11 +11132,9 @@
         </w:tblBorders>
       </w:tblPr>
       <w:tblGrid>
-        <w:gridCol w:w="831"/>
-        <w:gridCol w:w="1912"/>
-        <w:gridCol w:w="1829"/>
+        <w:gridCol w:w="997"/>
         <w:gridCol w:w="2494"/>
-        <w:gridCol w:w="1246"/>
+        <w:gridCol w:w="4821"/>
       </w:tblGrid>
       <w:tr>
         <w:trPr>
@@ -11133,14 +11142,14 @@
         </w:trPr>
         <w:tc>
           <w:tcPr>
-            <w:tcW w:type="dxa" w:w="831"/>
+            <w:tcW w:type="dxa" w:w="997"/>
+            <w:vAlign w:val="center"/>
             <w:tcMar>
               <w:top w:w="65" w:type="dxa"/>
               <w:start w:w="80" w:type="dxa"/>
               <w:bottom w:w="65" w:type="dxa"/>
               <w:end w:w="80" w:type="dxa"/>
             </w:tcMar>
-            <w:vAlign w:val="center"/>
             <w:shd w:fill="EDEDED" w:val="clear"/>
             <w:tcBorders>
               <w:bottom w:val="single" w:sz="8" w:color="000000" w:space="0"/>
@@ -11163,14 +11172,14 @@
         </w:tc>
         <w:tc>
           <w:tcPr>
-            <w:tcW w:type="dxa" w:w="1912"/>
+            <w:tcW w:type="dxa" w:w="2494"/>
+            <w:vAlign w:val="center"/>
             <w:tcMar>
               <w:top w:w="65" w:type="dxa"/>
               <w:start w:w="80" w:type="dxa"/>
               <w:bottom w:w="65" w:type="dxa"/>
               <w:end w:w="80" w:type="dxa"/>
             </w:tcMar>
-            <w:vAlign w:val="center"/>
             <w:shd w:fill="EDEDED" w:val="clear"/>
             <w:tcBorders>
               <w:bottom w:val="single" w:sz="8" w:color="000000" w:space="0"/>
@@ -11193,14 +11202,14 @@
         </w:tc>
         <w:tc>
           <w:tcPr>
-            <w:tcW w:type="dxa" w:w="1829"/>
+            <w:tcW w:type="dxa" w:w="4821"/>
+            <w:vAlign w:val="center"/>
             <w:tcMar>
               <w:top w:w="65" w:type="dxa"/>
               <w:start w:w="80" w:type="dxa"/>
               <w:bottom w:w="65" w:type="dxa"/>
               <w:end w:w="80" w:type="dxa"/>
             </w:tcMar>
-            <w:vAlign w:val="center"/>
             <w:shd w:fill="EDEDED" w:val="clear"/>
             <w:tcBorders>
               <w:bottom w:val="single" w:sz="8" w:color="000000" w:space="0"/>
@@ -11217,67 +11226,7 @@
                 <w:b/>
                 <w:sz w:val="21"/>
               </w:rPr>
-              <w:t>需求产出</w:t>
-            </w:r>
-          </w:p>
-        </w:tc>
-        <w:tc>
-          <w:tcPr>
-            <w:tcW w:type="dxa" w:w="2494"/>
-            <w:tcMar>
-              <w:top w:w="65" w:type="dxa"/>
-              <w:start w:w="80" w:type="dxa"/>
-              <w:bottom w:w="65" w:type="dxa"/>
-              <w:end w:w="80" w:type="dxa"/>
-            </w:tcMar>
-            <w:vAlign w:val="center"/>
-            <w:shd w:fill="EDEDED" w:val="clear"/>
-            <w:tcBorders>
-              <w:bottom w:val="single" w:sz="8" w:color="000000" w:space="0"/>
-            </w:tcBorders>
-          </w:tcPr>
-          <w:p>
-            <w:pPr>
-              <w:spacing w:before="0" w:after="0" w:line="276" w:lineRule="auto"/>
-              <w:jc w:val="center"/>
-            </w:pPr>
-            <w:r>
-              <w:rPr>
-                <w:rFonts w:ascii="Times New Roman" w:hAnsi="Times New Roman" w:eastAsia="宋体"/>
-                <w:b/>
-                <w:sz w:val="21"/>
-              </w:rPr>
-              <w:t>设计产出</w:t>
-            </w:r>
-          </w:p>
-        </w:tc>
-        <w:tc>
-          <w:tcPr>
-            <w:tcW w:type="dxa" w:w="1246"/>
-            <w:tcMar>
-              <w:top w:w="65" w:type="dxa"/>
-              <w:start w:w="80" w:type="dxa"/>
-              <w:bottom w:w="65" w:type="dxa"/>
-              <w:end w:w="80" w:type="dxa"/>
-            </w:tcMar>
-            <w:vAlign w:val="center"/>
-            <w:shd w:fill="EDEDED" w:val="clear"/>
-            <w:tcBorders>
-              <w:bottom w:val="single" w:sz="8" w:color="000000" w:space="0"/>
-            </w:tcBorders>
-          </w:tcPr>
-          <w:p>
-            <w:pPr>
-              <w:spacing w:before="0" w:after="0" w:line="276" w:lineRule="auto"/>
-              <w:jc w:val="center"/>
-            </w:pPr>
-            <w:r>
-              <w:rPr>
-                <w:rFonts w:ascii="Times New Roman" w:hAnsi="Times New Roman" w:eastAsia="宋体"/>
-                <w:b/>
-                <w:sz w:val="21"/>
-              </w:rPr>
-              <w:t>测试重点</w:t>
+              <w:t>主要交付</w:t>
             </w:r>
           </w:p>
         </w:tc>
@@ -11288,14 +11237,14 @@
         </w:trPr>
         <w:tc>
           <w:tcPr>
-            <w:tcW w:type="dxa" w:w="831"/>
+            <w:tcW w:type="dxa" w:w="997"/>
+            <w:vAlign w:val="center"/>
             <w:tcMar>
               <w:top w:w="65" w:type="dxa"/>
               <w:start w:w="80" w:type="dxa"/>
               <w:bottom w:w="65" w:type="dxa"/>
               <w:end w:w="80" w:type="dxa"/>
             </w:tcMar>
-            <w:vAlign w:val="center"/>
           </w:tcPr>
           <w:p>
             <w:pPr>
@@ -11305,6 +11254,7 @@
             <w:r>
               <w:rPr>
                 <w:rFonts w:ascii="Times New Roman" w:hAnsi="Times New Roman" w:eastAsia="宋体"/>
+                <w:b w:val="0"/>
                 <w:sz w:val="21"/>
               </w:rPr>
               <w:t>赵文彪</w:t>
@@ -11313,14 +11263,14 @@
         </w:tc>
         <w:tc>
           <w:tcPr>
-            <w:tcW w:type="dxa" w:w="1912"/>
+            <w:tcW w:type="dxa" w:w="2494"/>
+            <w:vAlign w:val="center"/>
             <w:tcMar>
               <w:top w:w="65" w:type="dxa"/>
               <w:start w:w="80" w:type="dxa"/>
               <w:bottom w:w="65" w:type="dxa"/>
               <w:end w:w="80" w:type="dxa"/>
             </w:tcMar>
-            <w:vAlign w:val="center"/>
           </w:tcPr>
           <w:p>
             <w:pPr>
@@ -11330,6 +11280,7 @@
             <w:r>
               <w:rPr>
                 <w:rFonts w:ascii="Times New Roman" w:hAnsi="Times New Roman" w:eastAsia="宋体"/>
+                <w:b w:val="0"/>
                 <w:sz w:val="21"/>
               </w:rPr>
               <w:t>统筹集成与开发工作流</w:t>
@@ -11338,14 +11289,14 @@
         </w:tc>
         <w:tc>
           <w:tcPr>
-            <w:tcW w:type="dxa" w:w="1829"/>
+            <w:tcW w:type="dxa" w:w="4821"/>
+            <w:vAlign w:val="center"/>
             <w:tcMar>
               <w:top w:w="65" w:type="dxa"/>
               <w:start w:w="80" w:type="dxa"/>
               <w:bottom w:w="65" w:type="dxa"/>
               <w:end w:w="80" w:type="dxa"/>
             </w:tcMar>
-            <w:vAlign w:val="center"/>
           </w:tcPr>
           <w:p>
             <w:pPr>
@@ -11355,59 +11306,10 @@
             <w:r>
               <w:rPr>
                 <w:rFonts w:ascii="Times New Roman" w:hAnsi="Times New Roman" w:eastAsia="宋体"/>
+                <w:b w:val="0"/>
                 <w:sz w:val="21"/>
               </w:rPr>
-              <w:t>总需求边界、进度与接口协调</w:t>
-            </w:r>
-          </w:p>
-        </w:tc>
-        <w:tc>
-          <w:tcPr>
-            <w:tcW w:type="dxa" w:w="2494"/>
-            <w:tcMar>
-              <w:top w:w="65" w:type="dxa"/>
-              <w:start w:w="80" w:type="dxa"/>
-              <w:bottom w:w="65" w:type="dxa"/>
-              <w:end w:w="80" w:type="dxa"/>
-            </w:tcMar>
-            <w:vAlign w:val="center"/>
-          </w:tcPr>
-          <w:p>
-            <w:pPr>
-              <w:spacing w:before="0" w:after="0" w:line="276" w:lineRule="auto"/>
-              <w:jc w:val="left"/>
-            </w:pPr>
-            <w:r>
-              <w:rPr>
-                <w:rFonts w:ascii="Times New Roman" w:hAnsi="Times New Roman" w:eastAsia="宋体"/>
-                <w:sz w:val="21"/>
-              </w:rPr>
-              <w:t>全局结构复核、文档统稿、部署方案</w:t>
-            </w:r>
-          </w:p>
-        </w:tc>
-        <w:tc>
-          <w:tcPr>
-            <w:tcW w:type="dxa" w:w="1246"/>
-            <w:tcMar>
-              <w:top w:w="65" w:type="dxa"/>
-              <w:start w:w="80" w:type="dxa"/>
-              <w:bottom w:w="65" w:type="dxa"/>
-              <w:end w:w="80" w:type="dxa"/>
-            </w:tcMar>
-            <w:vAlign w:val="center"/>
-          </w:tcPr>
-          <w:p>
-            <w:pPr>
-              <w:spacing w:before="0" w:after="0" w:line="276" w:lineRule="auto"/>
-              <w:jc w:val="left"/>
-            </w:pPr>
-            <w:r>
-              <w:rPr>
-                <w:rFonts w:ascii="Times New Roman" w:hAnsi="Times New Roman" w:eastAsia="宋体"/>
-                <w:sz w:val="21"/>
-              </w:rPr>
-              <w:t>集成演示、回归检查</w:t>
+              <w:t>总需求、接口协调、结构复核、文档统稿、部署验证</w:t>
             </w:r>
           </w:p>
         </w:tc>
@@ -11418,14 +11320,14 @@
         </w:trPr>
         <w:tc>
           <w:tcPr>
-            <w:tcW w:type="dxa" w:w="831"/>
+            <w:tcW w:type="dxa" w:w="997"/>
+            <w:vAlign w:val="center"/>
             <w:tcMar>
               <w:top w:w="65" w:type="dxa"/>
               <w:start w:w="80" w:type="dxa"/>
               <w:bottom w:w="65" w:type="dxa"/>
               <w:end w:w="80" w:type="dxa"/>
             </w:tcMar>
-            <w:vAlign w:val="center"/>
           </w:tcPr>
           <w:p>
             <w:pPr>
@@ -11435,6 +11337,7 @@
             <w:r>
               <w:rPr>
                 <w:rFonts w:ascii="Times New Roman" w:hAnsi="Times New Roman" w:eastAsia="宋体"/>
+                <w:b w:val="0"/>
                 <w:sz w:val="21"/>
               </w:rPr>
               <w:t>陶语涵</w:t>
@@ -11443,14 +11346,14 @@
         </w:tc>
         <w:tc>
           <w:tcPr>
-            <w:tcW w:type="dxa" w:w="1912"/>
+            <w:tcW w:type="dxa" w:w="2494"/>
+            <w:vAlign w:val="center"/>
             <w:tcMar>
               <w:top w:w="65" w:type="dxa"/>
               <w:start w:w="80" w:type="dxa"/>
               <w:bottom w:w="65" w:type="dxa"/>
               <w:end w:w="80" w:type="dxa"/>
             </w:tcMar>
-            <w:vAlign w:val="center"/>
           </w:tcPr>
           <w:p>
             <w:pPr>
@@ -11460,6 +11363,7 @@
             <w:r>
               <w:rPr>
                 <w:rFonts w:ascii="Times New Roman" w:hAnsi="Times New Roman" w:eastAsia="宋体"/>
+                <w:b w:val="0"/>
                 <w:sz w:val="21"/>
               </w:rPr>
               <w:t>笔记系统、评论点赞</w:t>
@@ -11468,14 +11372,14 @@
         </w:tc>
         <w:tc>
           <w:tcPr>
-            <w:tcW w:type="dxa" w:w="1829"/>
+            <w:tcW w:type="dxa" w:w="4821"/>
+            <w:vAlign w:val="center"/>
             <w:tcMar>
               <w:top w:w="65" w:type="dxa"/>
               <w:start w:w="80" w:type="dxa"/>
               <w:bottom w:w="65" w:type="dxa"/>
               <w:end w:w="80" w:type="dxa"/>
             </w:tcMar>
-            <w:vAlign w:val="center"/>
           </w:tcPr>
           <w:p>
             <w:pPr>
@@ -11485,59 +11389,10 @@
             <w:r>
               <w:rPr>
                 <w:rFonts w:ascii="Times New Roman" w:hAnsi="Times New Roman" w:eastAsia="宋体"/>
+                <w:b w:val="0"/>
                 <w:sz w:val="21"/>
               </w:rPr>
-              <w:t>匿名访客、注册用户；7 个用例</w:t>
-            </w:r>
-          </w:p>
-        </w:tc>
-        <w:tc>
-          <w:tcPr>
-            <w:tcW w:type="dxa" w:w="2494"/>
-            <w:tcMar>
-              <w:top w:w="65" w:type="dxa"/>
-              <w:start w:w="80" w:type="dxa"/>
-              <w:bottom w:w="65" w:type="dxa"/>
-              <w:end w:w="80" w:type="dxa"/>
-            </w:tcMar>
-            <w:vAlign w:val="center"/>
-          </w:tcPr>
-          <w:p>
-            <w:pPr>
-              <w:spacing w:before="0" w:after="0" w:line="276" w:lineRule="auto"/>
-              <w:jc w:val="left"/>
-            </w:pPr>
-            <w:r>
-              <w:rPr>
-                <w:rFonts w:ascii="Times New Roman" w:hAnsi="Times New Roman" w:eastAsia="宋体"/>
-                <w:sz w:val="21"/>
-              </w:rPr>
-              <w:t>Note/Draft/Like/Comment；类图、顺序图、状态图</w:t>
-            </w:r>
-          </w:p>
-        </w:tc>
-        <w:tc>
-          <w:tcPr>
-            <w:tcW w:type="dxa" w:w="1246"/>
-            <w:tcMar>
-              <w:top w:w="65" w:type="dxa"/>
-              <w:start w:w="80" w:type="dxa"/>
-              <w:bottom w:w="65" w:type="dxa"/>
-              <w:end w:w="80" w:type="dxa"/>
-            </w:tcMar>
-            <w:vAlign w:val="center"/>
-          </w:tcPr>
-          <w:p>
-            <w:pPr>
-              <w:spacing w:before="0" w:after="0" w:line="276" w:lineRule="auto"/>
-              <w:jc w:val="left"/>
-            </w:pPr>
-            <w:r>
-              <w:rPr>
-                <w:rFonts w:ascii="Times New Roman" w:hAnsi="Times New Roman" w:eastAsia="宋体"/>
-                <w:sz w:val="21"/>
-              </w:rPr>
-              <w:t>发布路径、AI 降级、点赞幂等</w:t>
+              <w:t>需求用例、Note/Draft/Like/Comment 设计、发布与 AI 测试</w:t>
             </w:r>
           </w:p>
         </w:tc>
@@ -11548,14 +11403,14 @@
         </w:trPr>
         <w:tc>
           <w:tcPr>
-            <w:tcW w:type="dxa" w:w="831"/>
+            <w:tcW w:type="dxa" w:w="997"/>
+            <w:vAlign w:val="center"/>
             <w:tcMar>
               <w:top w:w="65" w:type="dxa"/>
               <w:start w:w="80" w:type="dxa"/>
               <w:bottom w:w="65" w:type="dxa"/>
               <w:end w:w="80" w:type="dxa"/>
             </w:tcMar>
-            <w:vAlign w:val="center"/>
           </w:tcPr>
           <w:p>
             <w:pPr>
@@ -11565,6 +11420,7 @@
             <w:r>
               <w:rPr>
                 <w:rFonts w:ascii="Times New Roman" w:hAnsi="Times New Roman" w:eastAsia="宋体"/>
+                <w:b w:val="0"/>
                 <w:sz w:val="21"/>
               </w:rPr>
               <w:t>丁水悦</w:t>
@@ -11573,14 +11429,14 @@
         </w:tc>
         <w:tc>
           <w:tcPr>
-            <w:tcW w:type="dxa" w:w="1912"/>
+            <w:tcW w:type="dxa" w:w="2494"/>
+            <w:vAlign w:val="center"/>
             <w:tcMar>
               <w:top w:w="65" w:type="dxa"/>
               <w:start w:w="80" w:type="dxa"/>
               <w:bottom w:w="65" w:type="dxa"/>
               <w:end w:w="80" w:type="dxa"/>
             </w:tcMar>
-            <w:vAlign w:val="center"/>
           </w:tcPr>
           <w:p>
             <w:pPr>
@@ -11590,6 +11446,7 @@
             <w:r>
               <w:rPr>
                 <w:rFonts w:ascii="Times New Roman" w:hAnsi="Times New Roman" w:eastAsia="宋体"/>
+                <w:b w:val="0"/>
                 <w:sz w:val="21"/>
               </w:rPr>
               <w:t>资料库、教务学分自查</w:t>
@@ -11598,14 +11455,14 @@
         </w:tc>
         <w:tc>
           <w:tcPr>
-            <w:tcW w:type="dxa" w:w="1829"/>
+            <w:tcW w:type="dxa" w:w="4821"/>
+            <w:vAlign w:val="center"/>
             <w:tcMar>
               <w:top w:w="65" w:type="dxa"/>
               <w:start w:w="80" w:type="dxa"/>
               <w:bottom w:w="65" w:type="dxa"/>
               <w:end w:w="80" w:type="dxa"/>
             </w:tcMar>
-            <w:vAlign w:val="center"/>
           </w:tcPr>
           <w:p>
             <w:pPr>
@@ -11615,59 +11472,10 @@
             <w:r>
               <w:rPr>
                 <w:rFonts w:ascii="Times New Roman" w:hAnsi="Times New Roman" w:eastAsia="宋体"/>
+                <w:b w:val="0"/>
                 <w:sz w:val="21"/>
               </w:rPr>
-              <w:t>注册用户、管理员；8 个用例</w:t>
-            </w:r>
-          </w:p>
-        </w:tc>
-        <w:tc>
-          <w:tcPr>
-            <w:tcW w:type="dxa" w:w="2494"/>
-            <w:tcMar>
-              <w:top w:w="65" w:type="dxa"/>
-              <w:start w:w="80" w:type="dxa"/>
-              <w:bottom w:w="65" w:type="dxa"/>
-              <w:end w:w="80" w:type="dxa"/>
-            </w:tcMar>
-            <w:vAlign w:val="center"/>
-          </w:tcPr>
-          <w:p>
-            <w:pPr>
-              <w:spacing w:before="0" w:after="0" w:line="276" w:lineRule="auto"/>
-              <w:jc w:val="left"/>
-            </w:pPr>
-            <w:r>
-              <w:rPr>
-                <w:rFonts w:ascii="Times New Roman" w:hAnsi="Times New Roman" w:eastAsia="宋体"/>
-                <w:sz w:val="21"/>
-              </w:rPr>
-              <w:t>MaterialResource/File/Notice；上传与成绩单流程</w:t>
-            </w:r>
-          </w:p>
-        </w:tc>
-        <w:tc>
-          <w:tcPr>
-            <w:tcW w:type="dxa" w:w="1246"/>
-            <w:tcMar>
-              <w:top w:w="65" w:type="dxa"/>
-              <w:start w:w="80" w:type="dxa"/>
-              <w:bottom w:w="65" w:type="dxa"/>
-              <w:end w:w="80" w:type="dxa"/>
-            </w:tcMar>
-            <w:vAlign w:val="center"/>
-          </w:tcPr>
-          <w:p>
-            <w:pPr>
-              <w:spacing w:before="0" w:after="0" w:line="276" w:lineRule="auto"/>
-              <w:jc w:val="left"/>
-            </w:pPr>
-            <w:r>
-              <w:rPr>
-                <w:rFonts w:ascii="Times New Roman" w:hAnsi="Times New Roman" w:eastAsia="宋体"/>
-                <w:sz w:val="21"/>
-              </w:rPr>
-              <w:t>50MB、魔数、PDF 不落盘、owner 权限</w:t>
+              <w:t>上传与预览、成绩单中转、PDF 不落盘、owner 权限测试</w:t>
             </w:r>
           </w:p>
         </w:tc>
@@ -11678,14 +11486,14 @@
         </w:trPr>
         <w:tc>
           <w:tcPr>
-            <w:tcW w:type="dxa" w:w="831"/>
+            <w:tcW w:type="dxa" w:w="997"/>
+            <w:vAlign w:val="center"/>
             <w:tcMar>
               <w:top w:w="65" w:type="dxa"/>
               <w:start w:w="80" w:type="dxa"/>
               <w:bottom w:w="65" w:type="dxa"/>
               <w:end w:w="80" w:type="dxa"/>
             </w:tcMar>
-            <w:vAlign w:val="center"/>
           </w:tcPr>
           <w:p>
             <w:pPr>
@@ -11695,6 +11503,7 @@
             <w:r>
               <w:rPr>
                 <w:rFonts w:ascii="Times New Roman" w:hAnsi="Times New Roman" w:eastAsia="宋体"/>
+                <w:b w:val="0"/>
                 <w:sz w:val="21"/>
               </w:rPr>
               <w:t>王艺婷</w:t>
@@ -11703,14 +11512,14 @@
         </w:tc>
         <w:tc>
           <w:tcPr>
-            <w:tcW w:type="dxa" w:w="1912"/>
+            <w:tcW w:type="dxa" w:w="2494"/>
+            <w:vAlign w:val="center"/>
             <w:tcMar>
               <w:top w:w="65" w:type="dxa"/>
               <w:start w:w="80" w:type="dxa"/>
               <w:bottom w:w="65" w:type="dxa"/>
               <w:end w:w="80" w:type="dxa"/>
             </w:tcMar>
-            <w:vAlign w:val="center"/>
           </w:tcPr>
           <w:p>
             <w:pPr>
@@ -11720,6 +11529,7 @@
             <w:r>
               <w:rPr>
                 <w:rFonts w:ascii="Times New Roman" w:hAnsi="Times New Roman" w:eastAsia="宋体"/>
+                <w:b w:val="0"/>
                 <w:sz w:val="21"/>
               </w:rPr>
               <w:t>导师/院校库、CCF 会议</w:t>
@@ -11728,14 +11538,14 @@
         </w:tc>
         <w:tc>
           <w:tcPr>
-            <w:tcW w:type="dxa" w:w="1829"/>
+            <w:tcW w:type="dxa" w:w="4821"/>
+            <w:vAlign w:val="center"/>
             <w:tcMar>
               <w:top w:w="65" w:type="dxa"/>
               <w:start w:w="80" w:type="dxa"/>
               <w:bottom w:w="65" w:type="dxa"/>
               <w:end w:w="80" w:type="dxa"/>
             </w:tcMar>
-            <w:vAlign w:val="center"/>
           </w:tcPr>
           <w:p>
             <w:pPr>
@@ -11745,59 +11555,10 @@
             <w:r>
               <w:rPr>
                 <w:rFonts w:ascii="Times New Roman" w:hAnsi="Times New Roman" w:eastAsia="宋体"/>
+                <w:b w:val="0"/>
                 <w:sz w:val="21"/>
               </w:rPr>
-              <w:t>匿名访客、外部系统、管理员；7 个用例</w:t>
-            </w:r>
-          </w:p>
-        </w:tc>
-        <w:tc>
-          <w:tcPr>
-            <w:tcW w:type="dxa" w:w="2494"/>
-            <w:tcMar>
-              <w:top w:w="65" w:type="dxa"/>
-              <w:start w:w="80" w:type="dxa"/>
-              <w:bottom w:w="65" w:type="dxa"/>
-              <w:end w:w="80" w:type="dxa"/>
-            </w:tcMar>
-            <w:vAlign w:val="center"/>
-          </w:tcPr>
-          <w:p>
-            <w:pPr>
-              <w:spacing w:before="0" w:after="0" w:line="276" w:lineRule="auto"/>
-              <w:jc w:val="left"/>
-            </w:pPr>
-            <w:r>
-              <w:rPr>
-                <w:rFonts w:ascii="Times New Roman" w:hAnsi="Times New Roman" w:eastAsia="宋体"/>
-                <w:sz w:val="21"/>
-              </w:rPr>
-              <w:t>只读库模型、外部数据 E-R、爬取降级流程</w:t>
-            </w:r>
-          </w:p>
-        </w:tc>
-        <w:tc>
-          <w:tcPr>
-            <w:tcW w:type="dxa" w:w="1246"/>
-            <w:tcMar>
-              <w:top w:w="65" w:type="dxa"/>
-              <w:start w:w="80" w:type="dxa"/>
-              <w:bottom w:w="65" w:type="dxa"/>
-              <w:end w:w="80" w:type="dxa"/>
-            </w:tcMar>
-            <w:vAlign w:val="center"/>
-          </w:tcPr>
-          <w:p>
-            <w:pPr>
-              <w:spacing w:before="0" w:after="0" w:line="276" w:lineRule="auto"/>
-              <w:jc w:val="left"/>
-            </w:pPr>
-            <w:r>
-              <w:rPr>
-                <w:rFonts w:ascii="Times New Roman" w:hAnsi="Times New Roman" w:eastAsia="宋体"/>
-                <w:sz w:val="21"/>
-              </w:rPr>
-              <w:t>拼音/首字母/CJK、closed 终态、降级兜底</w:t>
+              <w:t>只读库模型、外部数据流、导师检索与会议降级测试</w:t>
             </w:r>
           </w:p>
         </w:tc>
@@ -11808,14 +11569,14 @@
         </w:trPr>
         <w:tc>
           <w:tcPr>
-            <w:tcW w:type="dxa" w:w="831"/>
+            <w:tcW w:type="dxa" w:w="997"/>
+            <w:vAlign w:val="center"/>
             <w:tcMar>
               <w:top w:w="65" w:type="dxa"/>
               <w:start w:w="80" w:type="dxa"/>
               <w:bottom w:w="65" w:type="dxa"/>
               <w:end w:w="80" w:type="dxa"/>
             </w:tcMar>
-            <w:vAlign w:val="center"/>
           </w:tcPr>
           <w:p>
             <w:pPr>
@@ -11825,6 +11586,7 @@
             <w:r>
               <w:rPr>
                 <w:rFonts w:ascii="Times New Roman" w:hAnsi="Times New Roman" w:eastAsia="宋体"/>
+                <w:b w:val="0"/>
                 <w:sz w:val="21"/>
               </w:rPr>
               <w:t>石建华</w:t>
@@ -11833,14 +11595,14 @@
         </w:tc>
         <w:tc>
           <w:tcPr>
-            <w:tcW w:type="dxa" w:w="1912"/>
+            <w:tcW w:type="dxa" w:w="2494"/>
+            <w:vAlign w:val="center"/>
             <w:tcMar>
               <w:top w:w="65" w:type="dxa"/>
               <w:start w:w="80" w:type="dxa"/>
               <w:bottom w:w="65" w:type="dxa"/>
               <w:end w:w="80" w:type="dxa"/>
             </w:tcMar>
-            <w:vAlign w:val="center"/>
           </w:tcPr>
           <w:p>
             <w:pPr>
@@ -11850,6 +11612,7 @@
             <w:r>
               <w:rPr>
                 <w:rFonts w:ascii="Times New Roman" w:hAnsi="Times New Roman" w:eastAsia="宋体"/>
+                <w:b w:val="0"/>
                 <w:sz w:val="21"/>
               </w:rPr>
               <w:t>管理后台、鉴权、班级空间</w:t>
@@ -11858,14 +11621,14 @@
         </w:tc>
         <w:tc>
           <w:tcPr>
-            <w:tcW w:type="dxa" w:w="1829"/>
+            <w:tcW w:type="dxa" w:w="4821"/>
+            <w:vAlign w:val="center"/>
             <w:tcMar>
               <w:top w:w="65" w:type="dxa"/>
               <w:start w:w="80" w:type="dxa"/>
               <w:bottom w:w="65" w:type="dxa"/>
               <w:end w:w="80" w:type="dxa"/>
             </w:tcMar>
-            <w:vAlign w:val="center"/>
           </w:tcPr>
           <w:p>
             <w:pPr>
@@ -11875,59 +11638,10 @@
             <w:r>
               <w:rPr>
                 <w:rFonts w:ascii="Times New Roman" w:hAnsi="Times New Roman" w:eastAsia="宋体"/>
+                <w:b w:val="0"/>
                 <w:sz w:val="21"/>
               </w:rPr>
-              <w:t>注册用户、管理员、超级管理员；7 个用例</w:t>
-            </w:r>
-          </w:p>
-        </w:tc>
-        <w:tc>
-          <w:tcPr>
-            <w:tcW w:type="dxa" w:w="2494"/>
-            <w:tcMar>
-              <w:top w:w="65" w:type="dxa"/>
-              <w:start w:w="80" w:type="dxa"/>
-              <w:bottom w:w="65" w:type="dxa"/>
-              <w:end w:w="80" w:type="dxa"/>
-            </w:tcMar>
-            <w:vAlign w:val="center"/>
-          </w:tcPr>
-          <w:p>
-            <w:pPr>
-              <w:spacing w:before="0" w:after="0" w:line="276" w:lineRule="auto"/>
-              <w:jc w:val="left"/>
-            </w:pPr>
-            <w:r>
-              <w:rPr>
-                <w:rFonts w:ascii="Times New Roman" w:hAnsi="Times New Roman" w:eastAsia="宋体"/>
-                <w:sz w:val="21"/>
-              </w:rPr>
-              <w:t>11 张 ORM 表、三级角色、班级/小组流程</w:t>
-            </w:r>
-          </w:p>
-        </w:tc>
-        <w:tc>
-          <w:tcPr>
-            <w:tcW w:type="dxa" w:w="1246"/>
-            <w:tcMar>
-              <w:top w:w="65" w:type="dxa"/>
-              <w:start w:w="80" w:type="dxa"/>
-              <w:bottom w:w="65" w:type="dxa"/>
-              <w:end w:w="80" w:type="dxa"/>
-            </w:tcMar>
-            <w:vAlign w:val="center"/>
-          </w:tcPr>
-          <w:p>
-            <w:pPr>
-              <w:spacing w:before="0" w:after="0" w:line="276" w:lineRule="auto"/>
-              <w:jc w:val="left"/>
-            </w:pPr>
-            <w:r>
-              <w:rPr>
-                <w:rFonts w:ascii="Times New Roman" w:hAnsi="Times New Roman" w:eastAsia="宋体"/>
-                <w:sz w:val="21"/>
-              </w:rPr>
-              <w:t>权限边界、一人一组、审批并发、硬删级联</w:t>
+              <w:t>三级角色、11 张 ORM 表、审批与硬删级联测试</w:t>
             </w:r>
           </w:p>
         </w:tc>
@@ -11936,6 +11650,7 @@
     <w:p>
       <w:pPr>
         <w:spacing w:before="0" w:after="0" w:line="360" w:lineRule="auto"/>
+        <w:ind w:firstLine="480"/>
         <w:jc w:val="left"/>
       </w:pPr>
       <w:r>
@@ -11950,6 +11665,7 @@
     <w:p>
       <w:pPr>
         <w:spacing w:before="0" w:after="0" w:line="360" w:lineRule="auto"/>
+        <w:ind w:firstLine="480"/>
         <w:jc w:val="left"/>
       </w:pPr>
       <w:r>
@@ -11964,6 +11680,7 @@
     <w:p>
       <w:pPr>
         <w:spacing w:before="0" w:after="0" w:line="360" w:lineRule="auto"/>
+        <w:ind w:firstLine="480"/>
         <w:jc w:val="left"/>
       </w:pPr>
       <w:r>
@@ -11978,6 +11695,7 @@
     <w:p>
       <w:pPr>
         <w:spacing w:before="0" w:after="0" w:line="360" w:lineRule="auto"/>
+        <w:ind w:firstLine="480"/>
         <w:jc w:val="left"/>
       </w:pPr>
       <w:r>
@@ -12007,6 +11725,7 @@
     <w:p>
       <w:pPr>
         <w:spacing w:before="0" w:after="0" w:line="360" w:lineRule="auto"/>
+        <w:ind w:firstLine="480"/>
         <w:jc w:val="left"/>
       </w:pPr>
       <w:r>
@@ -12501,6 +12220,7 @@
     <w:p>
       <w:pPr>
         <w:spacing w:before="0" w:after="0" w:line="360" w:lineRule="auto"/>
+        <w:ind w:firstLine="480"/>
         <w:jc w:val="left"/>
       </w:pPr>
       <w:r>
@@ -12530,6 +12250,7 @@
     <w:p>
       <w:pPr>
         <w:spacing w:before="0" w:after="0" w:line="360" w:lineRule="auto"/>
+        <w:ind w:firstLine="480"/>
         <w:jc w:val="left"/>
       </w:pPr>
       <w:r>
@@ -12574,6 +12295,7 @@
     <w:p>
       <w:pPr>
         <w:spacing w:before="0" w:after="0" w:line="360" w:lineRule="auto"/>
+        <w:ind w:firstLine="480"/>
         <w:jc w:val="left"/>
       </w:pPr>
       <w:r>
@@ -12603,6 +12325,7 @@
     <w:p>
       <w:pPr>
         <w:spacing w:before="0" w:after="0" w:line="360" w:lineRule="auto"/>
+        <w:ind w:firstLine="480"/>
         <w:jc w:val="left"/>
       </w:pPr>
       <w:r>
@@ -12632,6 +12355,7 @@
     <w:p>
       <w:pPr>
         <w:spacing w:before="0" w:after="0" w:line="360" w:lineRule="auto"/>
+        <w:ind w:firstLine="480"/>
         <w:jc w:val="left"/>
       </w:pPr>
       <w:r>
@@ -12661,6 +12385,7 @@
     <w:p>
       <w:pPr>
         <w:spacing w:before="0" w:after="0" w:line="360" w:lineRule="auto"/>
+        <w:ind w:firstLine="480"/>
         <w:jc w:val="left"/>
       </w:pPr>
       <w:r>

</xml_diff>